<commit_message>
fix(docs): paraphrase section for clarity
</commit_message>
<xml_diff>
--- a/docs/docx/bab-3-reconciled-2026-10-29.docx
+++ b/docs/docx/bab-3-reconciled-2026-10-29.docx
@@ -11499,222 +11499,153 @@
           <w:rFonts w:ascii="Times New Roman" w:hAnsi="Times New Roman" w:cs="Times New Roman"/>
           <w:color w:val="FF0000"/>
         </w:rPr>
-        <w:t xml:space="preserve">melalui </w:t>
+        <w:t xml:space="preserve">melalui penilaian manusia, AI, atau keduanya</w:t>
+      </w:r>
+      <w:r>
+        <w:rPr>
+          <w:rFonts w:ascii="Times New Roman" w:hAnsi="Times New Roman" w:cs="Times New Roman"/>
+        </w:rPr>
+        <w:t xml:space="preserve"> yang </w:t>
       </w:r>
       <w:r>
         <w:rPr>
           <w:rFonts w:ascii="Times New Roman" w:hAnsi="Times New Roman" w:cs="Times New Roman"/>
           <w:color w:val="FF0000"/>
-          <w:i/>
-        </w:rPr>
-        <w:t xml:space="preserve">workflow</w:t>
+        </w:rPr>
+        <w:t xml:space="preserve">ditetapkan sebelum eksekusi. Jika keduanya digunakan,</w:t>
+      </w:r>
+      <w:r>
+        <w:rPr>
+          <w:rFonts w:ascii="Times New Roman" w:hAnsi="Times New Roman" w:cs="Times New Roman"/>
+        </w:rPr>
+        <w:t xml:space="preserve"> penilaian </w:t>
       </w:r>
       <w:r>
         <w:rPr>
           <w:rFonts w:ascii="Times New Roman" w:hAnsi="Times New Roman" w:cs="Times New Roman"/>
           <w:color w:val="FF0000"/>
         </w:rPr>
+        <w:t xml:space="preserve">manusia</w:t>
+      </w:r>
+      <w:r>
+        <w:rPr>
+          <w:rFonts w:ascii="Times New Roman" w:hAnsi="Times New Roman" w:cs="Times New Roman"/>
+        </w:rPr>
+        <w:t xml:space="preserve"> dan </w:t>
+      </w:r>
+      <w:r>
+        <w:rPr>
+          <w:rFonts w:ascii="Times New Roman" w:hAnsi="Times New Roman" w:cs="Times New Roman"/>
+          <w:color w:val="FF0000"/>
+          <w:i/>
+        </w:rPr>
+        <w:t xml:space="preserve">AI</w:t>
+      </w:r>
+      <w:r>
+        <w:rPr>
+          <w:rFonts w:ascii="Times New Roman" w:hAnsi="Times New Roman" w:cs="Times New Roman"/>
+        </w:rPr>
         <w:t xml:space="preserve"> </w:t>
       </w:r>
       <w:r>
         <w:rPr>
           <w:rFonts w:ascii="Times New Roman" w:hAnsi="Times New Roman" w:cs="Times New Roman"/>
           <w:color w:val="FF0000"/>
-          <w:i/>
-        </w:rPr>
-        <w:t xml:space="preserve">human</w:t>
+        </w:rPr>
+        <w:t xml:space="preserve">dilakukan</w:t>
+      </w:r>
+      <w:r>
+        <w:rPr>
+          <w:rFonts w:ascii="Times New Roman" w:hAnsi="Times New Roman" w:cs="Times New Roman"/>
+        </w:rPr>
+        <w:t xml:space="preserve"> </w:t>
       </w:r>
       <w:r>
         <w:rPr>
           <w:rFonts w:ascii="Times New Roman" w:hAnsi="Times New Roman" w:cs="Times New Roman"/>
           <w:color w:val="FF0000"/>
         </w:rPr>
+        <w:t xml:space="preserve">secara</w:t>
+      </w:r>
+      <w:r>
+        <w:rPr>
+          <w:rFonts w:ascii="Times New Roman" w:hAnsi="Times New Roman" w:cs="Times New Roman"/>
+        </w:rPr>
+        <w:t xml:space="preserve"> </w:t>
+      </w:r>
+      <w:r>
+        <w:rPr>
+          <w:rFonts w:ascii="Times New Roman" w:hAnsi="Times New Roman" w:cs="Times New Roman"/>
+          <w:color w:val="FF0000"/>
+        </w:rPr>
+        <w:t xml:space="preserve">terpisah</w:t>
+      </w:r>
+      <w:r>
+        <w:rPr>
+          <w:rFonts w:ascii="Times New Roman" w:hAnsi="Times New Roman" w:cs="Times New Roman"/>
+        </w:rPr>
+        <w:t xml:space="preserve">. Komponen lain </w:t>
+      </w:r>
+      <w:r>
+        <w:rPr>
+          <w:rFonts w:ascii="Times New Roman" w:hAnsi="Times New Roman" w:cs="Times New Roman"/>
+          <w:color w:val="FF0000"/>
+        </w:rPr>
+        <w:t xml:space="preserve">diperiksa</w:t>
+      </w:r>
+      <w:r>
+        <w:rPr>
+          <w:rFonts w:ascii="Times New Roman" w:hAnsi="Times New Roman" w:cs="Times New Roman"/>
+        </w:rPr>
+        <w:t xml:space="preserve"> berdasarkan aturan, </w:t>
+      </w:r>
+      <w:r>
+        <w:rPr>
+          <w:rFonts w:ascii="Times New Roman" w:hAnsi="Times New Roman" w:cs="Times New Roman"/>
+          <w:color w:val="FF0000"/>
+        </w:rPr>
+        <w:t xml:space="preserve">bukti</w:t>
+      </w:r>
+      <w:r>
+        <w:rPr>
+          <w:rFonts w:ascii="Times New Roman" w:hAnsi="Times New Roman" w:cs="Times New Roman"/>
+        </w:rPr>
+        <w:t xml:space="preserve"> </w:t>
+      </w:r>
+      <w:r>
+        <w:rPr>
+          <w:rFonts w:ascii="Times New Roman" w:hAnsi="Times New Roman" w:cs="Times New Roman"/>
+          <w:color w:val="FF0000"/>
+        </w:rPr>
+        <w:t xml:space="preserve">eksekusi</w:t>
+      </w:r>
+      <w:r>
+        <w:rPr>
+          <w:rFonts w:ascii="Times New Roman" w:hAnsi="Times New Roman" w:cs="Times New Roman"/>
+        </w:rPr>
         <w:t xml:space="preserve">, </w:t>
       </w:r>
       <w:r>
         <w:rPr>
           <w:rFonts w:ascii="Times New Roman" w:hAnsi="Times New Roman" w:cs="Times New Roman"/>
           <w:color w:val="FF0000"/>
-          <w:i/>
-        </w:rPr>
-        <w:t xml:space="preserve">ai</w:t>
+        </w:rPr>
+        <w:t xml:space="preserve">keputusan</w:t>
+      </w:r>
+      <w:r>
+        <w:rPr>
+          <w:rFonts w:ascii="Times New Roman" w:hAnsi="Times New Roman" w:cs="Times New Roman"/>
+          <w:i/>
+          <w:iCs/>
+        </w:rPr>
+        <w:t xml:space="preserve"> </w:t>
       </w:r>
       <w:r>
         <w:rPr>
           <w:rFonts w:ascii="Times New Roman" w:hAnsi="Times New Roman" w:cs="Times New Roman"/>
           <w:color w:val="FF0000"/>
         </w:rPr>
-        <w:t xml:space="preserve">, atau </w:t>
-      </w:r>
-      <w:r>
-        <w:rPr>
-          <w:rFonts w:ascii="Times New Roman" w:hAnsi="Times New Roman" w:cs="Times New Roman"/>
-          <w:color w:val="FF0000"/>
-          <w:i/>
-        </w:rPr>
-        <w:t xml:space="preserve">both</w:t>
-      </w:r>
-      <w:r>
-        <w:rPr>
-          <w:rFonts w:ascii="Times New Roman" w:hAnsi="Times New Roman" w:cs="Times New Roman"/>
-        </w:rPr>
-        <w:t xml:space="preserve"> yang </w:t>
-      </w:r>
-      <w:r>
-        <w:rPr>
-          <w:rFonts w:ascii="Times New Roman" w:hAnsi="Times New Roman" w:cs="Times New Roman"/>
-          <w:color w:val="FF0000"/>
-        </w:rPr>
-        <w:t xml:space="preserve">ditetapkan sebelum eksekusi. Dalam mode </w:t>
-      </w:r>
-      <w:r>
-        <w:rPr>
-          <w:rFonts w:ascii="Times New Roman" w:hAnsi="Times New Roman" w:cs="Times New Roman"/>
-          <w:color w:val="FF0000"/>
-          <w:i/>
-        </w:rPr>
-        <w:t xml:space="preserve">both</w:t>
-      </w:r>
-      <w:r>
-        <w:rPr>
-          <w:rFonts w:ascii="Times New Roman" w:hAnsi="Times New Roman" w:cs="Times New Roman"/>
-          <w:color w:val="FF0000"/>
-        </w:rPr>
-        <w:t xml:space="preserve">,</w:t>
-      </w:r>
-      <w:r>
-        <w:rPr>
-          <w:rFonts w:ascii="Times New Roman" w:hAnsi="Times New Roman" w:cs="Times New Roman"/>
-        </w:rPr>
-        <w:t xml:space="preserve"> penilaian </w:t>
-      </w:r>
-      <w:r>
-        <w:rPr>
-          <w:rFonts w:ascii="Times New Roman" w:hAnsi="Times New Roman" w:cs="Times New Roman"/>
-          <w:color w:val="FF0000"/>
-        </w:rPr>
-        <w:t xml:space="preserve">manusia</w:t>
-      </w:r>
-      <w:r>
-        <w:rPr>
-          <w:rFonts w:ascii="Times New Roman" w:hAnsi="Times New Roman" w:cs="Times New Roman"/>
-        </w:rPr>
-        <w:t xml:space="preserve"> dan </w:t>
-      </w:r>
-      <w:r>
-        <w:rPr>
-          <w:rFonts w:ascii="Times New Roman" w:hAnsi="Times New Roman" w:cs="Times New Roman"/>
-          <w:color w:val="FF0000"/>
-          <w:i/>
-        </w:rPr>
-        <w:t xml:space="preserve">AI</w:t>
-      </w:r>
-      <w:r>
-        <w:rPr>
-          <w:rFonts w:ascii="Times New Roman" w:hAnsi="Times New Roman" w:cs="Times New Roman"/>
-        </w:rPr>
-        <w:t xml:space="preserve"> </w:t>
-      </w:r>
-      <w:r>
-        <w:rPr>
-          <w:rFonts w:ascii="Times New Roman" w:hAnsi="Times New Roman" w:cs="Times New Roman"/>
-          <w:color w:val="FF0000"/>
-        </w:rPr>
-        <w:t xml:space="preserve">dilakukan</w:t>
-      </w:r>
-      <w:r>
-        <w:rPr>
-          <w:rFonts w:ascii="Times New Roman" w:hAnsi="Times New Roman" w:cs="Times New Roman"/>
-        </w:rPr>
-        <w:t xml:space="preserve"> </w:t>
-      </w:r>
-      <w:r>
-        <w:rPr>
-          <w:rFonts w:ascii="Times New Roman" w:hAnsi="Times New Roman" w:cs="Times New Roman"/>
-          <w:color w:val="FF0000"/>
-        </w:rPr>
-        <w:t xml:space="preserve">secara</w:t>
-      </w:r>
-      <w:r>
-        <w:rPr>
-          <w:rFonts w:ascii="Times New Roman" w:hAnsi="Times New Roman" w:cs="Times New Roman"/>
-        </w:rPr>
-        <w:t xml:space="preserve"> </w:t>
-      </w:r>
-      <w:r>
-        <w:rPr>
-          <w:rFonts w:ascii="Times New Roman" w:hAnsi="Times New Roman" w:cs="Times New Roman"/>
-          <w:color w:val="FF0000"/>
-        </w:rPr>
-        <w:t xml:space="preserve">terpisah</w:t>
-      </w:r>
-      <w:r>
-        <w:rPr>
-          <w:rFonts w:ascii="Times New Roman" w:hAnsi="Times New Roman" w:cs="Times New Roman"/>
-        </w:rPr>
-        <w:t xml:space="preserve">. Komponen lain </w:t>
-      </w:r>
-      <w:r>
-        <w:rPr>
-          <w:rFonts w:ascii="Times New Roman" w:hAnsi="Times New Roman" w:cs="Times New Roman"/>
-          <w:color w:val="FF0000"/>
-        </w:rPr>
-        <w:t xml:space="preserve">diperiksa</w:t>
-      </w:r>
-      <w:r>
-        <w:rPr>
-          <w:rFonts w:ascii="Times New Roman" w:hAnsi="Times New Roman" w:cs="Times New Roman"/>
-        </w:rPr>
-        <w:t xml:space="preserve"> berdasarkan aturan, </w:t>
-      </w:r>
-      <w:r>
-        <w:rPr>
-          <w:rFonts w:ascii="Times New Roman" w:hAnsi="Times New Roman" w:cs="Times New Roman"/>
-          <w:color w:val="FF0000"/>
-        </w:rPr>
-        <w:t xml:space="preserve">bukti</w:t>
-      </w:r>
-      <w:r>
-        <w:rPr>
-          <w:rFonts w:ascii="Times New Roman" w:hAnsi="Times New Roman" w:cs="Times New Roman"/>
-        </w:rPr>
-        <w:t xml:space="preserve"> </w:t>
-      </w:r>
-      <w:r>
-        <w:rPr>
-          <w:rFonts w:ascii="Times New Roman" w:hAnsi="Times New Roman" w:cs="Times New Roman"/>
-          <w:color w:val="FF0000"/>
-        </w:rPr>
-        <w:t xml:space="preserve">eksekusi</w:t>
-      </w:r>
-      <w:r>
-        <w:rPr>
-          <w:rFonts w:ascii="Times New Roman" w:hAnsi="Times New Roman" w:cs="Times New Roman"/>
-        </w:rPr>
-        <w:t xml:space="preserve">, </w:t>
-      </w:r>
-      <w:r>
-        <w:rPr>
-          <w:rFonts w:ascii="Times New Roman" w:hAnsi="Times New Roman" w:cs="Times New Roman"/>
-          <w:color w:val="FF0000"/>
-        </w:rPr>
-        <w:t xml:space="preserve">keputusan</w:t>
-      </w:r>
-      <w:r>
-        <w:rPr>
-          <w:rFonts w:ascii="Times New Roman" w:hAnsi="Times New Roman" w:cs="Times New Roman"/>
-          <w:i/>
-          <w:iCs/>
-        </w:rPr>
-        <w:t xml:space="preserve"> </w:t>
-      </w:r>
-      <w:r>
-        <w:rPr>
-          <w:rFonts w:ascii="Times New Roman" w:hAnsi="Times New Roman" w:cs="Times New Roman"/>
-          <w:color w:val="FF0000"/>
-          <w:i/>
-        </w:rPr>
-        <w:t xml:space="preserve">verifier</w:t>
+        <w:t xml:space="preserve">komponen verifikasi</w:t>
       </w:r>
       <w:r>
         <w:rPr>
@@ -12501,173 +12432,7 @@
                 <w:color w:val="EE0000"/>
                 <w:sz w:val="20"/>
               </w:rPr>
-              <w:t xml:space="preserve">Validasi </w:t>
-            </w:r>
-            <w:r>
-              <w:rPr>
-                <w:rFonts w:ascii="Times New Roman" w:hAnsi="Times New Roman" w:cs="Times New Roman"/>
-                <w:color w:val="FF0000"/>
-              </w:rPr>
-              <w:t xml:space="preserve">dan pemeriksaan sinyal </w:t>
-            </w:r>
-            <w:r>
-              <w:rPr>
-                <w:rFonts w:ascii="Times New Roman" w:eastAsia="Times New Roman" w:hAnsi="Times New Roman" w:cs="Times New Roman"/>
-                <w:color w:val="EE0000"/>
-                <w:sz w:val="20"/>
-              </w:rPr>
-              <w:t xml:space="preserve">otomatis</w:t>
-            </w:r>
-            <w:r>
-              <w:rPr>
-                <w:rFonts w:ascii="Times New Roman" w:hAnsi="Times New Roman" w:cs="Times New Roman"/>
-                <w:color w:val="FF0000"/>
-              </w:rPr>
-              <w:t xml:space="preserve">.</w:t>
-            </w:r>
-            <w:r>
-              <w:rPr>
-                <w:rFonts w:ascii="Times New Roman" w:eastAsia="Times New Roman" w:hAnsi="Times New Roman" w:cs="Times New Roman"/>
-                <w:color w:val="EE0000"/>
-                <w:sz w:val="20"/>
-              </w:rPr>
-              <w:t xml:space="preserve"> </w:t>
-            </w:r>
-            <w:r>
-              <w:rPr>
-                <w:rFonts w:ascii="Times New Roman" w:hAnsi="Times New Roman" w:cs="Times New Roman"/>
-                <w:color w:val="FF0000"/>
-              </w:rPr>
-              <w:t xml:space="preserve">Penilaian</w:t>
-            </w:r>
-            <w:r>
-              <w:rPr>
-                <w:rFonts w:ascii="Times New Roman" w:eastAsia="Times New Roman" w:hAnsi="Times New Roman" w:cs="Times New Roman"/>
-                <w:color w:val="EE0000"/>
-                <w:sz w:val="20"/>
-              </w:rPr>
-              <w:t xml:space="preserve"> </w:t>
-            </w:r>
-            <w:r>
-              <w:rPr>
-                <w:rFonts w:ascii="Times New Roman" w:hAnsi="Times New Roman" w:cs="Times New Roman"/>
-                <w:color w:val="FF0000"/>
-              </w:rPr>
-              <w:t xml:space="preserve">manusia</w:t>
-            </w:r>
-            <w:r>
-              <w:rPr>
-                <w:rFonts w:ascii="Times New Roman" w:eastAsia="Times New Roman" w:hAnsi="Times New Roman" w:cs="Times New Roman"/>
-                <w:color w:val="EE0000"/>
-                <w:sz w:val="20"/>
-              </w:rPr>
-              <w:t xml:space="preserve"> </w:t>
-            </w:r>
-            <w:r>
-              <w:rPr>
-                <w:rFonts w:ascii="Times New Roman" w:hAnsi="Times New Roman" w:cs="Times New Roman"/>
-                <w:color w:val="FF0000"/>
-              </w:rPr>
-              <w:t xml:space="preserve">atau</w:t>
-            </w:r>
-            <w:r>
-              <w:rPr>
-                <w:rFonts w:ascii="Times New Roman" w:eastAsia="Times New Roman" w:hAnsi="Times New Roman" w:cs="Times New Roman"/>
-                <w:color w:val="EE0000"/>
-                <w:sz w:val="20"/>
-              </w:rPr>
-              <w:t xml:space="preserve"> </w:t>
-            </w:r>
-            <w:r>
-              <w:rPr>
-                <w:rFonts w:ascii="Times New Roman" w:hAnsi="Times New Roman" w:cs="Times New Roman"/>
-                <w:color w:val="FF0000"/>
-                <w:i/>
-              </w:rPr>
-              <w:t xml:space="preserve">AI</w:t>
-            </w:r>
-            <w:r>
-              <w:rPr>
-                <w:rFonts w:ascii="Times New Roman" w:eastAsia="Times New Roman" w:hAnsi="Times New Roman" w:cs="Times New Roman"/>
-                <w:color w:val="EE0000"/>
-                <w:sz w:val="20"/>
-              </w:rPr>
-              <w:t xml:space="preserve"> </w:t>
-            </w:r>
-            <w:r>
-              <w:rPr>
-                <w:rFonts w:ascii="Times New Roman" w:hAnsi="Times New Roman" w:cs="Times New Roman"/>
-                <w:color w:val="FF0000"/>
-              </w:rPr>
-              <w:t xml:space="preserve">dilakukan</w:t>
-            </w:r>
-            <w:r>
-              <w:rPr>
-                <w:rFonts w:ascii="Times New Roman" w:eastAsia="Times New Roman" w:hAnsi="Times New Roman" w:cs="Times New Roman"/>
-                <w:color w:val="EE0000"/>
-                <w:sz w:val="20"/>
-              </w:rPr>
-              <w:t xml:space="preserve"> </w:t>
-            </w:r>
-            <w:r>
-              <w:rPr>
-                <w:rFonts w:ascii="Times New Roman" w:hAnsi="Times New Roman" w:cs="Times New Roman"/>
-                <w:color w:val="FF0000"/>
-              </w:rPr>
-              <w:t xml:space="preserve">terpisah</w:t>
-            </w:r>
-            <w:r>
-              <w:rPr>
-                <w:rFonts w:ascii="Times New Roman" w:eastAsia="Times New Roman" w:hAnsi="Times New Roman" w:cs="Times New Roman"/>
-                <w:color w:val="EE0000"/>
-                <w:sz w:val="20"/>
-              </w:rPr>
-              <w:t xml:space="preserve"> </w:t>
-            </w:r>
-            <w:r>
-              <w:rPr>
-                <w:rFonts w:ascii="Times New Roman" w:hAnsi="Times New Roman" w:cs="Times New Roman"/>
-                <w:color w:val="FF0000"/>
-              </w:rPr>
-              <w:t xml:space="preserve">sesuai</w:t>
-            </w:r>
-            <w:r>
-              <w:rPr>
-                <w:rFonts w:ascii="Times New Roman" w:eastAsia="Times New Roman" w:hAnsi="Times New Roman" w:cs="Times New Roman"/>
-                <w:color w:val="EE0000"/>
-                <w:sz w:val="20"/>
-              </w:rPr>
-              <w:t xml:space="preserve"> </w:t>
-            </w:r>
-            <w:r>
-              <w:rPr>
-                <w:rFonts w:ascii="Times New Roman" w:hAnsi="Times New Roman" w:cs="Times New Roman"/>
-                <w:color w:val="FF0000"/>
-                <w:i/>
-              </w:rPr>
-              <w:t xml:space="preserve">workflow</w:t>
-            </w:r>
-            <w:r>
-              <w:rPr>
-                <w:rFonts w:ascii="Times New Roman" w:hAnsi="Times New Roman" w:cs="Times New Roman"/>
-                <w:color w:val="FF0000"/>
-              </w:rPr>
-              <w:t xml:space="preserve">, berdasarkan artefak dan batas skor yang didukung bukti (</w:t>
-            </w:r>
-            <w:r>
-              <w:rPr>
-                <w:rFonts w:ascii="Times New Roman" w:hAnsi="Times New Roman" w:cs="Times New Roman"/>
-                <w:color w:val="FF0000"/>
-                <w:i/>
-              </w:rPr>
-              <w:t xml:space="preserve">proof ceiling</w:t>
-            </w:r>
-            <w:r>
-              <w:rPr>
-                <w:rFonts w:ascii="Times New Roman" w:hAnsi="Times New Roman" w:cs="Times New Roman"/>
-                <w:color w:val="FF0000"/>
-              </w:rPr>
-              <w:t xml:space="preserve">).</w:t>
+              <w:t xml:space="preserve">Validasi dan pemeriksaan sinyal dilakukan secara otomatis. Penilaian manusia atau AI dilakukan secara terpisah sesuai prosedur yang ditetapkan, dengan merujuk pada artefak dan batas skor yang dapat didukung oleh bukti.</w:t>
             </w:r>
           </w:p>
         </w:tc>
@@ -14152,30 +13917,7 @@
           <w:rFonts w:ascii="Times New Roman" w:hAnsi="Times New Roman" w:cs="Times New Roman"/>
           <w:color w:val="FF0000"/>
         </w:rPr>
-        <w:t xml:space="preserve">, serta penilaian manusia atau </w:t>
-      </w:r>
-      <w:r>
-        <w:rPr>
-          <w:rFonts w:ascii="Times New Roman" w:hAnsi="Times New Roman" w:cs="Times New Roman"/>
-          <w:color w:val="FF0000"/>
-          <w:i/>
-        </w:rPr>
-        <w:t xml:space="preserve">AI</w:t>
-      </w:r>
-      <w:r>
-        <w:rPr>
-          <w:rFonts w:ascii="Times New Roman" w:hAnsi="Times New Roman" w:cs="Times New Roman"/>
-          <w:color w:val="FF0000"/>
-        </w:rPr>
-        <w:t xml:space="preserve"> sesuai </w:t>
-      </w:r>
-      <w:r>
-        <w:rPr>
-          <w:rFonts w:ascii="Times New Roman" w:hAnsi="Times New Roman" w:cs="Times New Roman"/>
-          <w:color w:val="FF0000"/>
-          <w:i/>
-        </w:rPr>
-        <w:t xml:space="preserve">workflow</w:t>
+        <w:t xml:space="preserve">, serta penilaian manusia atau AI sesuai prosedur yang ditetapkan</w:t>
       </w:r>
       <w:r>
         <w:rPr>
@@ -14876,37 +14618,7 @@
           <w:rFonts w:ascii="Times New Roman" w:hAnsi="Times New Roman" w:cs="Times New Roman"/>
           <w:color w:val="FF0000"/>
         </w:rPr>
-        <w:t xml:space="preserve">Ketersediaan penilaian dicatat bersama nilai rubrik. Jika bukti mendukung suatu tingkat, komponen diberi nilai 0 sampai 4. Nilai </w:t>
-      </w:r>
-      <w:r>
-        <w:rPr>
-          <w:rFonts w:ascii="Times New Roman" w:hAnsi="Times New Roman" w:cs="Times New Roman"/>
-          <w:color w:val="FF0000"/>
-          <w:i/>
-        </w:rPr>
-        <w:t xml:space="preserve">null/pending</w:t>
-      </w:r>
-      <w:r>
-        <w:rPr>
-          <w:rFonts w:ascii="Times New Roman" w:hAnsi="Times New Roman" w:cs="Times New Roman"/>
-          <w:color w:val="FF0000"/>
-        </w:rPr>
-        <w:t xml:space="preserve"> menunjukkan bahwa bukti atau penilaian wajib belum tersedia; </w:t>
-      </w:r>
-      <w:r>
-        <w:rPr>
-          <w:rFonts w:ascii="Times New Roman" w:hAnsi="Times New Roman" w:cs="Times New Roman"/>
-          <w:color w:val="FF0000"/>
-          <w:i/>
-        </w:rPr>
-        <w:t xml:space="preserve">not_applicable</w:t>
-      </w:r>
-      <w:r>
-        <w:rPr>
-          <w:rFonts w:ascii="Times New Roman" w:hAnsi="Times New Roman" w:cs="Times New Roman"/>
-          <w:color w:val="FF0000"/>
-        </w:rPr>
-        <w:t xml:space="preserve"> menunjukkan bahwa metrik memang berada di luar konteks pengukuran. Keduanya bukan tingkat numerik keenam dan tidak mengubah bobot formula.</w:t>
+        <w:t xml:space="preserve">Setiap komponen dinilai dengan skor 0 sampai 4 apabila bukti yang tersedia mendukung kriteria pada rubrik. Apabila bukti atau penilaian yang diwajibkan belum tersedia, komponen tersebut dicatat sebagai belum dapat dinilai. Metrik yang berada di luar konteks pengukuran dicatat sebagai tidak berlaku. Kedua keterangan tersebut merupakan status penilaian dan tidak menambah tingkat skor maupun mengubah bobot dalam rumus.</w:t>
       </w:r>
     </w:p>
     <w:p>
@@ -14922,37 +14634,7 @@
           <w:rFonts w:ascii="Times New Roman" w:hAnsi="Times New Roman" w:cs="Times New Roman"/>
           <w:color w:val="FF0000"/>
         </w:rPr>
-        <w:t xml:space="preserve">Pada pemilihan metode, prasyarat yang diketahui salah menghasilkan Smethod = 1. Jika status prasyarat belum diketahui, Smethod tetap </w:t>
-      </w:r>
-      <w:r>
-        <w:rPr>
-          <w:rFonts w:ascii="Times New Roman" w:hAnsi="Times New Roman" w:cs="Times New Roman"/>
-          <w:color w:val="FF0000"/>
-          <w:i/>
-        </w:rPr>
-        <w:t xml:space="preserve">null/pending</w:t>
-      </w:r>
-      <w:r>
-        <w:rPr>
-          <w:rFonts w:ascii="Times New Roman" w:hAnsi="Times New Roman" w:cs="Times New Roman"/>
-          <w:color w:val="FF0000"/>
-        </w:rPr>
-        <w:t xml:space="preserve"> dengan alasan bukti yang hilang. Kandidat valid yang telah dieksekusi dapat memperoleh nilai 0 bila bukti negatif terverifikasi memadai; tidak adanya keberhasilan saja tidak cukup. Bukti parsial yang positif tetap dinilai sesuai batas bukti, misalnya ketika </w:t>
-      </w:r>
-      <w:r>
-        <w:rPr>
-          <w:rFonts w:ascii="Times New Roman" w:hAnsi="Times New Roman" w:cs="Times New Roman"/>
-          <w:color w:val="FF0000"/>
-          <w:i/>
-        </w:rPr>
-        <w:t xml:space="preserve">oracle</w:t>
-      </w:r>
-      <w:r>
-        <w:rPr>
-          <w:rFonts w:ascii="Times New Roman" w:hAnsi="Times New Roman" w:cs="Times New Roman"/>
-          <w:color w:val="FF0000"/>
-        </w:rPr>
-        <w:t xml:space="preserve"> yang hilang membatasi konfirmasi penuh.</w:t>
+        <w:t xml:space="preserve">Pada pemilihan metode, nilai Smethod = 1 diberikan apabila prasyarat metode diketahui tidak terpenuhi. Jika status prasyarat belum dapat dipastikan, penilaian ditunda dengan mencatat bukti yang masih diperlukan. Kandidat valid yang telah dieksekusi dapat memperoleh skor 0 apabila terdapat bukti negatif yang memadai dan telah diverifikasi. Tidak munculnya keberhasilan saja belum cukup untuk menetapkan skor tersebut. Hasil positif yang masih parsial dinilai sesuai bukti yang tersedia, termasuk ketika ketiadaan acuan independen membatasi konfirmasi penuh.</w:t>
       </w:r>
     </w:p>
     <w:p>
@@ -14968,82 +14650,23 @@
           <w:rFonts w:ascii="Times New Roman" w:hAnsi="Times New Roman" w:cs="Times New Roman"/>
           <w:color w:val="FF0000"/>
         </w:rPr>
-        <w:t xml:space="preserve">Bukti respons, kontrol, pemeringkatan, </w:t>
+        <w:t xml:space="preserve">Kekurangan bukti respons, hasil kontrol, acuan pemeringkatan, acuan verifikasi independen, atau penilaian menyebabkan komponen terkait belum dapat diberi nilai. Komponen lain tetap dinilai apabila buktinya mencukupi. Kekurangan yang berasal dari operator, lingkungan pengujian, atau </w:t>
       </w:r>
       <w:r>
         <w:rPr>
           <w:rFonts w:ascii="Times New Roman" w:hAnsi="Times New Roman" w:cs="Times New Roman"/>
           <w:color w:val="FF0000"/>
           <w:i/>
-        </w:rPr>
-        <w:t xml:space="preserve">oracle</w:t>
+          <w:iCs/>
+        </w:rPr>
+        <w:t xml:space="preserve">framework</w:t>
       </w:r>
       <w:r>
         <w:rPr>
           <w:rFonts w:ascii="Times New Roman" w:hAnsi="Times New Roman" w:cs="Times New Roman"/>
           <w:color w:val="FF0000"/>
         </w:rPr>
-        <w:t xml:space="preserve">, atau penilaian yang hilang membuat metrik atau komponen terkait tetap </w:t>
-      </w:r>
-      <w:r>
-        <w:rPr>
-          <w:rFonts w:ascii="Times New Roman" w:hAnsi="Times New Roman" w:cs="Times New Roman"/>
-          <w:color w:val="FF0000"/>
-          <w:i/>
-        </w:rPr>
-        <w:t xml:space="preserve">null/pending</w:t>
-      </w:r>
-      <w:r>
-        <w:rPr>
-          <w:rFonts w:ascii="Times New Roman" w:hAnsi="Times New Roman" w:cs="Times New Roman"/>
-          <w:color w:val="FF0000"/>
-        </w:rPr>
-        <w:t xml:space="preserve">; komponen lain yang didukung bukti tetap dinilai. Kekurangan bukti operator, lingkungan, atau framework tidak otomatis menjadi kegagalan model. Keluaran model yang tidak sesuai format dan tercatat dengan baik tetap dapat dinilai menurut rubrik </w:t>
-      </w:r>
-      <w:r>
-        <w:rPr>
-          <w:rFonts w:ascii="Times New Roman" w:hAnsi="Times New Roman" w:cs="Times New Roman"/>
-          <w:color w:val="FF0000"/>
-          <w:i/>
-        </w:rPr>
-        <w:t xml:space="preserve">output</w:t>
-      </w:r>
-      <w:r>
-        <w:rPr>
-          <w:rFonts w:ascii="Times New Roman" w:hAnsi="Times New Roman" w:cs="Times New Roman"/>
-          <w:color w:val="FF0000"/>
-        </w:rPr>
-        <w:t xml:space="preserve">. Jika komponen wajib atau penyebut kandidat yang memenuhi syarat tidak tersedia, </w:t>
-      </w:r>
-      <w:r>
-        <w:rPr>
-          <w:rFonts w:ascii="Times New Roman" w:hAnsi="Times New Roman" w:cs="Times New Roman"/>
-          <w:color w:val="FF0000"/>
-          <w:i/>
-        </w:rPr>
-        <w:t xml:space="preserve">Srun_final</w:t>
-      </w:r>
-      <w:r>
-        <w:rPr>
-          <w:rFonts w:ascii="Times New Roman" w:hAnsi="Times New Roman" w:cs="Times New Roman"/>
-          <w:color w:val="FF0000"/>
-        </w:rPr>
-        <w:t xml:space="preserve"> tetap </w:t>
-      </w:r>
-      <w:r>
-        <w:rPr>
-          <w:rFonts w:ascii="Times New Roman" w:hAnsi="Times New Roman" w:cs="Times New Roman"/>
-          <w:color w:val="FF0000"/>
-          <w:i/>
-        </w:rPr>
-        <w:t xml:space="preserve">null/pending</w:t>
-      </w:r>
-      <w:r>
-        <w:rPr>
-          <w:rFonts w:ascii="Times New Roman" w:hAnsi="Times New Roman" w:cs="Times New Roman"/>
-          <w:color w:val="FF0000"/>
-        </w:rPr>
-        <w:t xml:space="preserve"> tanpa penggantian nilai hilang dengan nol atau perubahan bobot.</w:t>
+        <w:t xml:space="preserve"> dicatat sesuai sumbernya agar tidak keliru dikaitkan dengan kemampuan model. Keluaran model yang tidak sesuai format tetap dinilai menurut rubrik kualitas keluaran apabila rekamannya tersedia. Skor akhir Srun hanya dihitung setelah seluruh komponen wajib dan jumlah kandidat yang menjadi dasar perhitungan dapat ditentukan. Nilai yang belum tersedia tidak diganti dengan nol dan bobot penilaian tetap dipertahankan.</w:t>
       </w:r>
     </w:p>
     <w:p>
@@ -15059,22 +14682,7 @@
           <w:rFonts w:ascii="Times New Roman" w:hAnsi="Times New Roman" w:cs="Times New Roman"/>
           <w:color w:val="FF0000"/>
         </w:rPr>
-        <w:t xml:space="preserve">Pada pengujian kontrol tanpa panggilan LLM, Soutput dicatat </w:t>
-      </w:r>
-      <w:r>
-        <w:rPr>
-          <w:rFonts w:ascii="Times New Roman" w:hAnsi="Times New Roman" w:cs="Times New Roman"/>
-          <w:color w:val="FF0000"/>
-          <w:i/>
-        </w:rPr>
-        <w:t xml:space="preserve">not_applicable</w:t>
-      </w:r>
-      <w:r>
-        <w:rPr>
-          <w:rFonts w:ascii="Times New Roman" w:hAnsi="Times New Roman" w:cs="Times New Roman"/>
-          <w:color w:val="FF0000"/>
-        </w:rPr>
-        <w:t xml:space="preserve"> dan skor komposit tesis tidak dihitung. Skor runtime scoring.v2 disimpan sebagai catatan historis sementara; skor final tesis berasal dari penilaian final dengan versi rubrik yang sesuai.</w:t>
+        <w:t xml:space="preserve">Pada pengujian kontrol yang tidak melibatkan pemanggilan LLM, penilaian Soutput tidak berlaku sehingga skor gabungan tesis tidak dihitung. Skor yang dihasilkan selama eksekusi oleh sistem penilaian versi 2 tetap disimpan sebagai catatan sementara untuk penelusuran historis. Penilaian akhir tesis menggunakan hasil evaluasi dan versi rubrik yang berlaku.</w:t>
       </w:r>
     </w:p>
     <w:p>
@@ -15090,142 +14698,7 @@
           <w:rFonts w:ascii="Times New Roman" w:hAnsi="Times New Roman" w:cs="Times New Roman"/>
           <w:color w:val="FF0000"/>
         </w:rPr>
-        <w:t xml:space="preserve">Smethod dinilai dari </w:t>
-      </w:r>
-      <w:r>
-        <w:rPr>
-          <w:rFonts w:ascii="Times New Roman" w:hAnsi="Times New Roman" w:cs="Times New Roman"/>
-          <w:color w:val="FF0000"/>
-          <w:i/>
-        </w:rPr>
-        <w:t xml:space="preserve">snapshot</w:t>
-      </w:r>
-      <w:r>
-        <w:rPr>
-          <w:rFonts w:ascii="Times New Roman" w:hAnsi="Times New Roman" w:cs="Times New Roman"/>
-          <w:color w:val="FF0000"/>
-        </w:rPr>
-        <w:t xml:space="preserve"> pemilihan terakhir menggunakan profil </w:t>
-      </w:r>
-      <w:r>
-        <w:rPr>
-          <w:rFonts w:ascii="Times New Roman" w:hAnsi="Times New Roman" w:cs="Times New Roman"/>
-          <w:color w:val="FF0000"/>
-          <w:i/>
-        </w:rPr>
-        <w:t xml:space="preserve">ranking</w:t>
-      </w:r>
-      <w:r>
-        <w:rPr>
-          <w:rFonts w:ascii="Times New Roman" w:hAnsi="Times New Roman" w:cs="Times New Roman"/>
-          <w:color w:val="FF0000"/>
-        </w:rPr>
-        <w:t xml:space="preserve"> yang dibekukan sebelum eksekusi. Profil mencakup seluruh metode pembanding yang layak, </w:t>
-      </w:r>
-      <w:r>
-        <w:rPr>
-          <w:rFonts w:ascii="Times New Roman" w:hAnsi="Times New Roman" w:cs="Times New Roman"/>
-          <w:color w:val="FF0000"/>
-          <w:i/>
-        </w:rPr>
-        <w:t xml:space="preserve">fit_level</w:t>
-      </w:r>
-      <w:r>
-        <w:rPr>
-          <w:rFonts w:ascii="Times New Roman" w:hAnsi="Times New Roman" w:cs="Times New Roman"/>
-          <w:color w:val="FF0000"/>
-        </w:rPr>
-        <w:t xml:space="preserve">, dan </w:t>
-      </w:r>
-      <w:r>
-        <w:rPr>
-          <w:rFonts w:ascii="Times New Roman" w:hAnsi="Times New Roman" w:cs="Times New Roman"/>
-          <w:color w:val="FF0000"/>
-          <w:i/>
-        </w:rPr>
-        <w:t xml:space="preserve">planned_request_count</w:t>
-      </w:r>
-      <w:r>
-        <w:rPr>
-          <w:rFonts w:ascii="Times New Roman" w:hAnsi="Times New Roman" w:cs="Times New Roman"/>
-          <w:color w:val="FF0000"/>
-        </w:rPr>
-        <w:t xml:space="preserve"> pada anggaran yang sama. Pasangan nilai terbaik yang sama memperoleh peringkat setara. Pilihan layak dengan peringkat lebih rendah memperoleh 2; pilihan teratas memperoleh 3, atau 4 bila rujukan alasan dan rencana terverifikasi. Tanpa profil yang diperlukan, Smethod dan </w:t>
-      </w:r>
-      <w:r>
-        <w:rPr>
-          <w:rFonts w:ascii="Times New Roman" w:hAnsi="Times New Roman" w:cs="Times New Roman"/>
-          <w:color w:val="FF0000"/>
-          <w:i/>
-        </w:rPr>
-        <w:t xml:space="preserve">Srun_final</w:t>
-      </w:r>
-      <w:r>
-        <w:rPr>
-          <w:rFonts w:ascii="Times New Roman" w:hAnsi="Times New Roman" w:cs="Times New Roman"/>
-          <w:color w:val="FF0000"/>
-        </w:rPr>
-        <w:t xml:space="preserve"> tetap </w:t>
-      </w:r>
-      <w:r>
-        <w:rPr>
-          <w:rFonts w:ascii="Times New Roman" w:hAnsi="Times New Roman" w:cs="Times New Roman"/>
-          <w:color w:val="FF0000"/>
-          <w:i/>
-        </w:rPr>
-        <w:t xml:space="preserve">pending</w:t>
-      </w:r>
-      <w:r>
-        <w:rPr>
-          <w:rFonts w:ascii="Times New Roman" w:hAnsi="Times New Roman" w:cs="Times New Roman"/>
-          <w:color w:val="FF0000"/>
-        </w:rPr>
-        <w:t xml:space="preserve">. Sumber </w:t>
-      </w:r>
-      <w:r>
-        <w:rPr>
-          <w:rFonts w:ascii="Times New Roman" w:hAnsi="Times New Roman" w:cs="Times New Roman"/>
-          <w:color w:val="FF0000"/>
-          <w:i/>
-        </w:rPr>
-        <w:t xml:space="preserve">model_orchestrator</w:t>
-      </w:r>
-      <w:r>
-        <w:rPr>
-          <w:rFonts w:ascii="Times New Roman" w:hAnsi="Times New Roman" w:cs="Times New Roman"/>
-          <w:color w:val="FF0000"/>
-        </w:rPr>
-        <w:t xml:space="preserve">, </w:t>
-      </w:r>
-      <w:r>
-        <w:rPr>
-          <w:rFonts w:ascii="Times New Roman" w:hAnsi="Times New Roman" w:cs="Times New Roman"/>
-          <w:color w:val="FF0000"/>
-          <w:i/>
-        </w:rPr>
-        <w:t xml:space="preserve">deterministic_fallback</w:t>
-      </w:r>
-      <w:r>
-        <w:rPr>
-          <w:rFonts w:ascii="Times New Roman" w:hAnsi="Times New Roman" w:cs="Times New Roman"/>
-          <w:color w:val="FF0000"/>
-        </w:rPr>
-        <w:t xml:space="preserve">, </w:t>
-      </w:r>
-      <w:r>
-        <w:rPr>
-          <w:rFonts w:ascii="Times New Roman" w:hAnsi="Times New Roman" w:cs="Times New Roman"/>
-          <w:color w:val="FF0000"/>
-          <w:i/>
-        </w:rPr>
-        <w:t xml:space="preserve">akg_route</w:t>
-      </w:r>
-      <w:r>
-        <w:rPr>
-          <w:rFonts w:ascii="Times New Roman" w:hAnsi="Times New Roman" w:cs="Times New Roman"/>
-          <w:color w:val="FF0000"/>
-        </w:rPr>
-        <w:t xml:space="preserve">, dan forced dicatat; pilihan paksa tidak dilaporkan sebagai kemampuan memilih LLM.</w:t>
+        <w:t xml:space="preserve">Penilaian Smethod mengacu pada rekaman pemilihan metode terakhir dan profil pemeringkatan yang ditetapkan sebelum eksekusi. Profil tersebut memuat seluruh metode pembanding yang memenuhi prasyarat, tingkat kesesuaian terhadap observasi, serta perkiraan jumlah permintaan pada anggaran yang sama. Metode dengan tingkat kesesuaian dan kebutuhan permintaan yang sama ditempatkan pada peringkat setara. Metode layak yang berada di bawah peringkat teratas memperoleh skor 2. Metode pada peringkat teratas memperoleh skor 3, atau skor 4 apabila alasan pemilihan dan rencana lanjutannya telah terverifikasi. Jika profil yang diperlukan belum tersedia, Smethod dan skor akhir Srun belum dapat ditetapkan. Asal keputusan juga dicatat, baik dari model, mekanisme cadangan deterministik, jalur AKG, maupun penetapan manual. Metode yang ditetapkan secara manual tidak digunakan sebagai bukti kemampuan model dalam memilih metode.</w:t>
       </w:r>
     </w:p>
     <w:p>
@@ -15641,7 +15114,7 @@
                 <w:szCs w:val="24"/>
                 <w:color w:val="FF0000"/>
               </w:rPr>
-              <w:t xml:space="preserve"> berdasarkan registry dan konteks pemilihan.</w:t>
+              <w:t xml:space="preserve"> berdasarkan daftar metode terdaftar dan konteks pemilihan.</w:t>
             </w:r>
           </w:p>
         </w:tc>
@@ -17355,8 +16828,19 @@
                 <w:sz w:val="20"/>
                 <w:szCs w:val="24"/>
                 <w:color w:val="FF0000"/>
-              </w:rPr>
-              <w:t xml:space="preserve">sqli_union yang berada pada peringkat teratas, merujuk pada observasi yang mendukung kelayakannya</w:t>
+                <w:i/>
+                <w:iCs/>
+              </w:rPr>
+              <w:t xml:space="preserve">UNION-based SQLi</w:t>
+            </w:r>
+            <w:r>
+              <w:rPr>
+                <w:rFonts w:ascii="Times New Roman" w:eastAsia="Times New Roman" w:hAnsi="Times New Roman" w:cs="Times New Roman"/>
+                <w:sz w:val="20"/>
+                <w:szCs w:val="24"/>
+                <w:color w:val="FF0000"/>
+              </w:rPr>
+              <w:t xml:space="preserve"> yang berada pada peringkat teratas, merujuk pada observasi yang mendukung kelayakannya</w:t>
             </w:r>
             <w:r>
               <w:rPr>
@@ -17978,12 +17462,11 @@
             <w:r>
               <w:rPr>
                 <w:rFonts w:ascii="Times New Roman" w:eastAsia="Times New Roman" w:hAnsi="Times New Roman" w:cs="Times New Roman"/>
-                <w:i/>
-                <w:sz w:val="20"/>
-                <w:szCs w:val="24"/>
-                <w:color w:val="FF0000"/>
-              </w:rPr>
-              <w:t xml:space="preserve">yang diwajibkan; atau respons kandidat valid sama dengan kontrol dan verifier memastikan sinyal metode tidak muncul</w:t>
+                <w:sz w:val="20"/>
+                <w:szCs w:val="24"/>
+                <w:color w:val="FF0000"/>
+              </w:rPr>
+              <w:t xml:space="preserve">yang diwajibkan; atau respons kandidat valid sama dengan kontrol dan komponen verifikasi memastikan sinyal metode tidak muncul</w:t>
             </w:r>
             <w:r>
               <w:rPr>
@@ -19592,12 +19075,11 @@
             <w:r>
               <w:rPr>
                 <w:rFonts w:ascii="Times New Roman" w:eastAsia="Times New Roman" w:hAnsi="Times New Roman" w:cs="Times New Roman"/>
-                <w:i/>
-                <w:sz w:val="20"/>
-                <w:szCs w:val="24"/>
-                <w:color w:val="FF0000"/>
-              </w:rPr>
-              <w:t xml:space="preserve">oracle</w:t>
+                <w:sz w:val="20"/>
+                <w:szCs w:val="24"/>
+                <w:color w:val="FF0000"/>
+              </w:rPr>
+              <w:t xml:space="preserve">acuan</w:t>
             </w:r>
             <w:r>
               <w:rPr>
@@ -20312,136 +19794,8 @@
         <w:rPr>
           <w:rFonts w:ascii="Times New Roman" w:hAnsi="Times New Roman" w:cs="Times New Roman"/>
           <w:color w:val="FF0000"/>
-          <w:i/>
-        </w:rPr>
-        <w:t xml:space="preserve">Spayload_final</w:t>
-      </w:r>
-      <w:r>
-        <w:rPr>
-          <w:rFonts w:ascii="Times New Roman" w:hAnsi="Times New Roman" w:cs="Times New Roman"/>
-          <w:color w:val="FF0000"/>
-        </w:rPr>
-        <w:t xml:space="preserve"> adalah rata-rata aritmetika skor kandidat dengan </w:t>
-      </w:r>
-      <w:r>
-        <w:rPr>
-          <w:rFonts w:ascii="Times New Roman" w:hAnsi="Times New Roman" w:cs="Times New Roman"/>
-          <w:color w:val="FF0000"/>
-          <w:i/>
-        </w:rPr>
-        <w:t xml:space="preserve">candidate_id</w:t>
-      </w:r>
-      <w:r>
-        <w:rPr>
-          <w:rFonts w:ascii="Times New Roman" w:hAnsi="Times New Roman" w:cs="Times New Roman"/>
-          <w:color w:val="FF0000"/>
-        </w:rPr>
-        <w:t xml:space="preserve"> unik yang valid dan telah dieksekusi pada tahap </w:t>
-      </w:r>
-      <w:r>
-        <w:rPr>
-          <w:rFonts w:ascii="Times New Roman" w:hAnsi="Times New Roman" w:cs="Times New Roman"/>
-          <w:color w:val="FF0000"/>
-          <w:i/>
-        </w:rPr>
-        <w:t xml:space="preserve">exploit</w:t>
-      </w:r>
-      <w:r>
-        <w:rPr>
-          <w:rFonts w:ascii="Times New Roman" w:hAnsi="Times New Roman" w:cs="Times New Roman"/>
-          <w:color w:val="FF0000"/>
-        </w:rPr>
-        <w:t xml:space="preserve"> atau </w:t>
-      </w:r>
-      <w:r>
-        <w:rPr>
-          <w:rFonts w:ascii="Times New Roman" w:hAnsi="Times New Roman" w:cs="Times New Roman"/>
-          <w:color w:val="FF0000"/>
-          <w:i/>
-        </w:rPr>
-        <w:t xml:space="preserve">bypass</w:t>
-      </w:r>
-      <w:r>
-        <w:rPr>
-          <w:rFonts w:ascii="Times New Roman" w:hAnsi="Times New Roman" w:cs="Times New Roman"/>
-          <w:color w:val="FF0000"/>
-        </w:rPr>
-        <w:t xml:space="preserve"> dalam metode final yang dipilih atau dieksekusi. </w:t>
-      </w:r>
-      <w:r>
-        <w:rPr>
-          <w:rFonts w:ascii="Times New Roman" w:hAnsi="Times New Roman" w:cs="Times New Roman"/>
-          <w:color w:val="FF0000"/>
-          <w:i/>
-        </w:rPr>
-        <w:t xml:space="preserve">Probe</w:t>
-      </w:r>
-      <w:r>
-        <w:rPr>
-          <w:rFonts w:ascii="Times New Roman" w:hAnsi="Times New Roman" w:cs="Times New Roman"/>
-          <w:color w:val="FF0000"/>
-        </w:rPr>
-        <w:t xml:space="preserve">, kandidat yang ditolak, kandidat yang belum dieksekusi, dan kandidat metode sebelumnya tidak masuk penyebut. Pengujian ulang kandidat yang sama tidak menambah penyebut. Pembilang, penyebut, </w:t>
-      </w:r>
-      <w:r>
-        <w:rPr>
-          <w:rFonts w:ascii="Times New Roman" w:hAnsi="Times New Roman" w:cs="Times New Roman"/>
-          <w:color w:val="FF0000"/>
-          <w:i/>
-        </w:rPr>
-        <w:t xml:space="preserve">provenance</w:t>
-      </w:r>
-      <w:r>
-        <w:rPr>
-          <w:rFonts w:ascii="Times New Roman" w:hAnsi="Times New Roman" w:cs="Times New Roman"/>
-          <w:color w:val="FF0000"/>
-        </w:rPr>
-        <w:t xml:space="preserve">, alasan penghentian, dan rujukan bukti disimpan. Jika penyebut kosong, </w:t>
-      </w:r>
-      <w:r>
-        <w:rPr>
-          <w:rFonts w:ascii="Times New Roman" w:hAnsi="Times New Roman" w:cs="Times New Roman"/>
-          <w:color w:val="FF0000"/>
-          <w:i/>
-        </w:rPr>
-        <w:t xml:space="preserve">Spayload_final</w:t>
-      </w:r>
-      <w:r>
-        <w:rPr>
-          <w:rFonts w:ascii="Times New Roman" w:hAnsi="Times New Roman" w:cs="Times New Roman"/>
-          <w:color w:val="FF0000"/>
-        </w:rPr>
-        <w:t xml:space="preserve"> dan </w:t>
-      </w:r>
-      <w:r>
-        <w:rPr>
-          <w:rFonts w:ascii="Times New Roman" w:hAnsi="Times New Roman" w:cs="Times New Roman"/>
-          <w:color w:val="FF0000"/>
-          <w:i/>
-        </w:rPr>
-        <w:t xml:space="preserve">Srun_final</w:t>
-      </w:r>
-      <w:r>
-        <w:rPr>
-          <w:rFonts w:ascii="Times New Roman" w:hAnsi="Times New Roman" w:cs="Times New Roman"/>
-          <w:color w:val="FF0000"/>
-        </w:rPr>
-        <w:t xml:space="preserve"> tetap </w:t>
-      </w:r>
-      <w:r>
-        <w:rPr>
-          <w:rFonts w:ascii="Times New Roman" w:hAnsi="Times New Roman" w:cs="Times New Roman"/>
-          <w:color w:val="FF0000"/>
-          <w:i/>
-        </w:rPr>
-        <w:t xml:space="preserve">null/pending</w:t>
-      </w:r>
-      <w:r>
-        <w:rPr>
-          <w:rFonts w:ascii="Times New Roman" w:hAnsi="Times New Roman" w:cs="Times New Roman"/>
-          <w:color w:val="FF0000"/>
-        </w:rPr>
-        <w:t xml:space="preserve">.</w:t>
+        </w:rPr>
+        <w:t xml:space="preserve">Nilai akhir Spayload dihitung sebagai rata-rata aritmetika skor kandidat valid yang telah dieksekusi pada tahap eksploitasi atau upaya melewati pembatasan, dalam metode terakhir yang dipilih atau dijalankan. Setiap kandidat dihitung satu kali berdasarkan identitas uniknya. Permintaan penjajakan, kandidat yang ditolak, kandidat yang belum dijalankan, dan kandidat dari metode sebelumnya tidak dimasukkan dalam perhitungan. Pengujian ulang terhadap kandidat yang sama tidak menambah jumlah kandidat. Nilai pembilang dan penyebut, asal-usul kandidat, alasan penghentian, serta rujukan buktinya disimpan agar perhitungan dapat ditelusuri. Apabila tidak ada kandidat yang memenuhi kriteria tersebut, nilai akhir Spayload dan Srun belum dapat dihitung.</w:t>
       </w:r>
     </w:p>
     <w:p>
@@ -20457,67 +19811,7 @@
           <w:rFonts w:ascii="Times New Roman" w:hAnsi="Times New Roman" w:cs="Times New Roman"/>
           <w:color w:val="FF0000"/>
         </w:rPr>
-        <w:t xml:space="preserve">Sinyal negatif terverifikasi dapat dinilai 0 melalui pemeriksaan sinyal bersama. Kandidat yang memiliki sinyal positif dinilai oleh manusia atau </w:t>
-      </w:r>
-      <w:r>
-        <w:rPr>
-          <w:rFonts w:ascii="Times New Roman" w:hAnsi="Times New Roman" w:cs="Times New Roman"/>
-          <w:color w:val="FF0000"/>
-          <w:i/>
-        </w:rPr>
-        <w:t xml:space="preserve">AI</w:t>
-      </w:r>
-      <w:r>
-        <w:rPr>
-          <w:rFonts w:ascii="Times New Roman" w:hAnsi="Times New Roman" w:cs="Times New Roman"/>
-          <w:color w:val="FF0000"/>
-        </w:rPr>
-        <w:t xml:space="preserve"> sesuai </w:t>
-      </w:r>
-      <w:r>
-        <w:rPr>
-          <w:rFonts w:ascii="Times New Roman" w:hAnsi="Times New Roman" w:cs="Times New Roman"/>
-          <w:color w:val="FF0000"/>
-          <w:i/>
-        </w:rPr>
-        <w:t xml:space="preserve">workflow</w:t>
-      </w:r>
-      <w:r>
-        <w:rPr>
-          <w:rFonts w:ascii="Times New Roman" w:hAnsi="Times New Roman" w:cs="Times New Roman"/>
-          <w:color w:val="FF0000"/>
-        </w:rPr>
-        <w:t xml:space="preserve"> yang dipilih dengan </w:t>
-      </w:r>
-      <w:r>
-        <w:rPr>
-          <w:rFonts w:ascii="Times New Roman" w:hAnsi="Times New Roman" w:cs="Times New Roman"/>
-          <w:color w:val="FF0000"/>
-          <w:i/>
-        </w:rPr>
-        <w:t xml:space="preserve">proof ceiling</w:t>
-      </w:r>
-      <w:r>
-        <w:rPr>
-          <w:rFonts w:ascii="Times New Roman" w:hAnsi="Times New Roman" w:cs="Times New Roman"/>
-          <w:color w:val="FF0000"/>
-        </w:rPr>
-        <w:t xml:space="preserve"> yang sama. Penilaian memerlukan bukti respons dan </w:t>
-      </w:r>
-      <w:r>
-        <w:rPr>
-          <w:rFonts w:ascii="Times New Roman" w:hAnsi="Times New Roman" w:cs="Times New Roman"/>
-          <w:color w:val="FF0000"/>
-          <w:i/>
-        </w:rPr>
-        <w:t xml:space="preserve">verifier</w:t>
-      </w:r>
-      <w:r>
-        <w:rPr>
-          <w:rFonts w:ascii="Times New Roman" w:hAnsi="Times New Roman" w:cs="Times New Roman"/>
-          <w:color w:val="FF0000"/>
-        </w:rPr>
-        <w:t xml:space="preserve"> yang terikat pada kandidat; keberhasilan tidak ditetapkan berdasarkan klaim model.</w:t>
+        <w:t xml:space="preserve">Kandidat dapat memperoleh skor 0 apabila pemeriksaan sinyal menunjukkan bukti negatif yang telah terverifikasi. Kandidat dengan sinyal positif dinilai oleh manusia atau AI sesuai prosedur yang dipilih, dengan batas skor yang sama berdasarkan kekuatan buktinya. Penilaian memerlukan respons dan hasil verifikasi yang dapat ditelusuri ke kandidat terkait. Klaim keberhasilan dari model tetap harus diperiksa terhadap bukti tersebut.</w:t>
       </w:r>
     </w:p>
     <w:p>
@@ -20979,7 +20273,7 @@
                 <w:szCs w:val="24"/>
                 <w:color w:val="FF0000"/>
               </w:rPr>
-              <w:t>Respons kandidat dan kontrol tidak menunjukkan perbedaan yang relevan, dan verifier mencatat sinyal metode tidak muncul.</w:t>
+              <w:t xml:space="preserve">Respons kandidat dan kontrol tidak menunjukkan perbedaan yang relevan, dan komponen verifikasi mencatat sinyal metode tidak muncul.</w:t>
             </w:r>
           </w:p>
         </w:tc>
@@ -21632,7 +20926,7 @@
                 <w:szCs w:val="24"/>
                 <w:color w:val="FF0000"/>
               </w:rPr>
-              <w:t xml:space="preserve"> melalui verifier metode.</w:t>
+              <w:t xml:space="preserve"> melalui komponen verifikasi metode.</w:t>
             </w:r>
           </w:p>
         </w:tc>
@@ -22374,7 +21668,7 @@
                 <w:szCs w:val="24"/>
                 <w:color w:val="FF0000"/>
               </w:rPr>
-              <w:t xml:space="preserve"> berdasarkan oracle izin dan respons.</w:t>
+              <w:t xml:space="preserve"> berdasarkan acuan izin independen dan respons.</w:t>
             </w:r>
           </w:p>
         </w:tc>
@@ -22406,7 +21700,7 @@
                 <w:szCs w:val="24"/>
                 <w:color w:val="FF0000"/>
               </w:rPr>
-              <w:t>Oracle menyatakan pengguna tidak berhak atas objek, dan respons pengujian menunjukkan akses ditolak.</w:t>
+              <w:t xml:space="preserve">Acuan menyatakan pengguna tidak berhak atas objek, dan respons pengujian menunjukkan akses ditolak.</w:t>
             </w:r>
           </w:p>
         </w:tc>
@@ -22917,7 +22211,7 @@
                 <w:szCs w:val="24"/>
                 <w:color w:val="FF0000"/>
               </w:rPr>
-              <w:t>Endpoint mengembalikan metadata objek, tetapi artefak belum mempunyai oracle izin yang mengikat pengguna, objek, dan tindakan yang dinilai.</w:t>
+              <w:t xml:space="preserve">Alamat layanan mengembalikan metadata objek, tetapi artefak belum mempunyai acuan izin independen yang mengikat pengguna, objek, dan tindakan yang dinilai.</w:t>
             </w:r>
           </w:p>
         </w:tc>
@@ -23071,7 +22365,7 @@
                 <w:szCs w:val="24"/>
                 <w:color w:val="FF0000"/>
               </w:rPr>
-              <w:t xml:space="preserve">oracle</w:t>
+              <w:t xml:space="preserve">acuan</w:t>
             </w:r>
             <w:r>
               <w:rPr>
@@ -23255,7 +22549,7 @@
                 <w:szCs w:val="24"/>
                 <w:color w:val="FF0000"/>
               </w:rPr>
-              <w:t xml:space="preserve"> melalui verifier dan oracle izin.</w:t>
+              <w:t xml:space="preserve"> melalui komponen verifikasi dan acuan izin independen.</w:t>
             </w:r>
           </w:p>
         </w:tc>
@@ -23287,7 +22581,7 @@
                 <w:szCs w:val="24"/>
                 <w:color w:val="FF0000"/>
               </w:rPr>
-              <w:t>Pengguna dengan peran terbatas memperoleh isi objek milik pengguna lain. Oracle fixture menyatakan tindakan tersebut dilarang, dan bukti akses mengikat identitas pengguna serta objek yang sama.</w:t>
+              <w:t xml:space="preserve">Pengguna dengan peran terbatas memperoleh isi objek milik pengguna lain. Acuan izin pada lingkungan uji menyatakan tindakan tersebut dilarang, dan bukti akses mengikat identitas pengguna serta objek yang sama.</w:t>
             </w:r>
           </w:p>
         </w:tc>
@@ -23606,7 +22900,27 @@
                 <w:szCs w:val="24"/>
                 <w:color w:val="FF0000"/>
               </w:rPr>
-              <w:t>Sesi dengan hak lebih tinggi yang terbukti berasal dari hasil Access Control digunakan pada metode tujuan dalam edge AKG yang telah ditetapkan, dan hasil tujuan terkonfirmasi dengan sesi sumber yang sama.</w:t>
+              <w:t xml:space="preserve">Sesi dengan hak lebih tinggi yang terbukti berasal dari hasil </w:t>
+            </w:r>
+            <w:r>
+              <w:rPr>
+                <w:rFonts w:ascii="Times New Roman" w:eastAsia="Times New Roman" w:hAnsi="Times New Roman" w:cs="Times New Roman"/>
+                <w:sz w:val="20"/>
+                <w:szCs w:val="24"/>
+                <w:color w:val="FF0000"/>
+                <w:i/>
+                <w:iCs/>
+              </w:rPr>
+              <w:t xml:space="preserve">Access Control</w:t>
+            </w:r>
+            <w:r>
+              <w:rPr>
+                <w:rFonts w:ascii="Times New Roman" w:eastAsia="Times New Roman" w:hAnsi="Times New Roman" w:cs="Times New Roman"/>
+                <w:sz w:val="20"/>
+                <w:szCs w:val="24"/>
+                <w:color w:val="FF0000"/>
+              </w:rPr>
+              <w:t xml:space="preserve"> digunakan pada metode tujuan dalam relasi AKG yang telah ditetapkan, dan hasil tujuan terkonfirmasi dengan sesi sumber yang sama.</w:t>
             </w:r>
           </w:p>
         </w:tc>
@@ -24127,7 +23441,7 @@
                 <w:szCs w:val="24"/>
                 <w:color w:val="FF0000"/>
               </w:rPr>
-              <w:t>Kandidat ditolak oleh mekanisme autentikasi, dan oracle mencatat tidak terbentuk sesi untuk identitas yang diuji.</w:t>
+              <w:t xml:space="preserve">Kandidat ditolak oleh mekanisme autentikasi, dan acuan mencatat tidak terbentuk sesi untuk identitas yang diuji.</w:t>
             </w:r>
           </w:p>
         </w:tc>
@@ -24757,7 +24071,7 @@
                 <w:szCs w:val="24"/>
                 <w:color w:val="FF0000"/>
               </w:rPr>
-              <w:t xml:space="preserve"> melalui verifier dan oracle sesi.</w:t>
+              <w:t xml:space="preserve"> melalui komponen verifikasi dan acuan sesi.</w:t>
             </w:r>
           </w:p>
         </w:tc>
@@ -24789,7 +24103,27 @@
                 <w:szCs w:val="24"/>
                 <w:color w:val="FF0000"/>
               </w:rPr>
-              <w:t>Kandidat menghasilkan sesi baru yang terikat pada identitas akun uji. Oracle independen mengonfirmasi identitas tersebut dan membedakannya dari sesi awal framework.</w:t>
+              <w:t xml:space="preserve">Kandidat menghasilkan sesi baru yang terikat pada identitas akun uji. Acuan independen mengonfirmasi identitas tersebut dan membedakannya dari sesi awal </w:t>
+            </w:r>
+            <w:r>
+              <w:rPr>
+                <w:rFonts w:ascii="Times New Roman" w:eastAsia="Times New Roman" w:hAnsi="Times New Roman" w:cs="Times New Roman"/>
+                <w:sz w:val="20"/>
+                <w:szCs w:val="24"/>
+                <w:color w:val="FF0000"/>
+                <w:i/>
+                <w:iCs/>
+              </w:rPr>
+              <w:t xml:space="preserve">framework</w:t>
+            </w:r>
+            <w:r>
+              <w:rPr>
+                <w:rFonts w:ascii="Times New Roman" w:eastAsia="Times New Roman" w:hAnsi="Times New Roman" w:cs="Times New Roman"/>
+                <w:sz w:val="20"/>
+                <w:szCs w:val="24"/>
+                <w:color w:val="FF0000"/>
+              </w:rPr>
+              <w:t xml:space="preserve">.</w:t>
             </w:r>
           </w:p>
         </w:tc>
@@ -25057,7 +24391,67 @@
                 <w:szCs w:val="24"/>
                 <w:color w:val="FF0000"/>
               </w:rPr>
-              <w:t>Sesi dari kandidat Brute Force digunakan pada langkah Access Control yang diizinkan oleh AKG. Catatan penggunaan sesi dan keputusan verifier tujuan terhubung dengan kandidat Brute Force sumber.</w:t>
+              <w:t xml:space="preserve">Sesi dari kandidat </w:t>
+            </w:r>
+            <w:r>
+              <w:rPr>
+                <w:rFonts w:ascii="Times New Roman" w:eastAsia="Times New Roman" w:hAnsi="Times New Roman" w:cs="Times New Roman"/>
+                <w:sz w:val="20"/>
+                <w:szCs w:val="24"/>
+                <w:color w:val="FF0000"/>
+                <w:i/>
+                <w:iCs/>
+              </w:rPr>
+              <w:t xml:space="preserve">Brute Force</w:t>
+            </w:r>
+            <w:r>
+              <w:rPr>
+                <w:rFonts w:ascii="Times New Roman" w:eastAsia="Times New Roman" w:hAnsi="Times New Roman" w:cs="Times New Roman"/>
+                <w:sz w:val="20"/>
+                <w:szCs w:val="24"/>
+                <w:color w:val="FF0000"/>
+              </w:rPr>
+              <w:t xml:space="preserve"> digunakan pada langkah </w:t>
+            </w:r>
+            <w:r>
+              <w:rPr>
+                <w:rFonts w:ascii="Times New Roman" w:eastAsia="Times New Roman" w:hAnsi="Times New Roman" w:cs="Times New Roman"/>
+                <w:sz w:val="20"/>
+                <w:szCs w:val="24"/>
+                <w:color w:val="FF0000"/>
+                <w:i/>
+                <w:iCs/>
+              </w:rPr>
+              <w:t xml:space="preserve">Access Control</w:t>
+            </w:r>
+            <w:r>
+              <w:rPr>
+                <w:rFonts w:ascii="Times New Roman" w:eastAsia="Times New Roman" w:hAnsi="Times New Roman" w:cs="Times New Roman"/>
+                <w:sz w:val="20"/>
+                <w:szCs w:val="24"/>
+                <w:color w:val="FF0000"/>
+              </w:rPr>
+              <w:t xml:space="preserve"> yang diizinkan oleh AKG. Catatan penggunaan sesi dan keputusan komponen verifikasi tujuan terhubung dengan kandidat </w:t>
+            </w:r>
+            <w:r>
+              <w:rPr>
+                <w:rFonts w:ascii="Times New Roman" w:eastAsia="Times New Roman" w:hAnsi="Times New Roman" w:cs="Times New Roman"/>
+                <w:sz w:val="20"/>
+                <w:szCs w:val="24"/>
+                <w:color w:val="FF0000"/>
+                <w:i/>
+                <w:iCs/>
+              </w:rPr>
+              <w:t xml:space="preserve">Brute Force</w:t>
+            </w:r>
+            <w:r>
+              <w:rPr>
+                <w:rFonts w:ascii="Times New Roman" w:eastAsia="Times New Roman" w:hAnsi="Times New Roman" w:cs="Times New Roman"/>
+                <w:sz w:val="20"/>
+                <w:szCs w:val="24"/>
+                <w:color w:val="FF0000"/>
+              </w:rPr>
+              <w:t xml:space="preserve"> sumber.</w:t>
             </w:r>
           </w:p>
         </w:tc>
@@ -25578,7 +24972,7 @@
                 <w:szCs w:val="24"/>
                 <w:color w:val="FF0000"/>
               </w:rPr>
-              <w:t xml:space="preserve"> berdasarkan bukti sumber dan edge AKG.</w:t>
+              <w:t xml:space="preserve"> berdasarkan bukti sumber dan relasi AKG.</w:t>
             </w:r>
           </w:p>
         </w:tc>
@@ -25695,7 +25089,7 @@
                 <w:szCs w:val="24"/>
                 <w:color w:val="FF0000"/>
               </w:rPr>
-              <w:t xml:space="preserve">sesi yang diperlukan oleh edge lanjutan yang tersedia</w:t>
+              <w:t xml:space="preserve">sesi yang diperlukan oleh relasi lanjutan yang tersedia</w:t>
             </w:r>
             <w:r>
               <w:rPr>
@@ -25814,7 +25208,7 @@
                 <w:szCs w:val="24"/>
                 <w:color w:val="FF0000"/>
               </w:rPr>
-              <w:t xml:space="preserve">hasil yang relevan dengan edge lanjutan</w:t>
+              <w:t xml:space="preserve">hasil yang relevan dengan relasi lanjutan</w:t>
             </w:r>
             <w:r>
               <w:rPr>
@@ -25831,7 +25225,7 @@
                 <w:szCs w:val="24"/>
                 <w:color w:val="FF0000"/>
               </w:rPr>
-              <w:t xml:space="preserve">material sumber atau prasyarat route</w:t>
+              <w:t xml:space="preserve">data atau sesi sumber atau prasyarat jalur lanjutan</w:t>
             </w:r>
             <w:r>
               <w:rPr>
@@ -25998,7 +25392,7 @@
                 <w:szCs w:val="24"/>
                 <w:color w:val="FF0000"/>
               </w:rPr>
-              <w:t xml:space="preserve">lemah</w:t>
+              <w:t xml:space="preserve">awal</w:t>
             </w:r>
             <w:r>
               <w:rPr>
@@ -26032,7 +25426,7 @@
                 <w:szCs w:val="24"/>
                 <w:color w:val="FF0000"/>
               </w:rPr>
-              <w:t xml:space="preserve">verifier sumber.</w:t>
+              <w:t xml:space="preserve">komponen verifikasi sumber.</w:t>
             </w:r>
           </w:p>
         </w:tc>
@@ -26106,7 +25500,7 @@
                 <w:szCs w:val="24"/>
                 <w:color w:val="FF0000"/>
               </w:rPr>
-              <w:t xml:space="preserve">akun yang relevan dengan outcome sumber pada AKG</w:t>
+              <w:t xml:space="preserve">akun yang relevan dengan hasil sumber pada AKG</w:t>
             </w:r>
             <w:r>
               <w:rPr>
@@ -26140,7 +25534,7 @@
                 <w:szCs w:val="24"/>
                 <w:color w:val="FF0000"/>
               </w:rPr>
-              <w:t xml:space="preserve">lengkap sehingga prasyarat route belum terpenuhi</w:t>
+              <w:t xml:space="preserve">lengkap sehingga prasyarat jalur lanjutan belum terpenuhi</w:t>
             </w:r>
             <w:r>
               <w:rPr>
@@ -26214,12 +25608,29 @@
             <w:r>
               <w:rPr>
                 <w:rFonts w:ascii="Times New Roman" w:eastAsia="Times New Roman" w:hAnsi="Times New Roman" w:cs="Times New Roman"/>
+                <w:sz w:val="20"/>
+                <w:szCs w:val="24"/>
+                <w:color w:val="FF0000"/>
+              </w:rPr>
+              <w:t xml:space="preserve">Data atau sesi</w:t>
+            </w:r>
+            <w:r>
+              <w:rPr>
+                <w:rFonts w:ascii="Times New Roman" w:eastAsia="Times New Roman" w:hAnsi="Times New Roman" w:cs="Times New Roman"/>
+                <w:sz w:val="20"/>
+                <w:szCs w:val="24"/>
+              </w:rPr>
+              <w:t xml:space="preserve"> </w:t>
+            </w:r>
+            <w:r>
+              <w:rPr>
+                <w:rFonts w:ascii="Times New Roman" w:eastAsia="Times New Roman" w:hAnsi="Times New Roman" w:cs="Times New Roman"/>
                 <w:i/>
                 <w:sz w:val="20"/>
                 <w:szCs w:val="24"/>
                 <w:color w:val="FF0000"/>
               </w:rPr>
-              <w:t xml:space="preserve">Material</w:t>
+              <w:t xml:space="preserve">sumber</w:t>
             </w:r>
             <w:r>
               <w:rPr>
@@ -26232,30 +25643,11 @@
             <w:r>
               <w:rPr>
                 <w:rFonts w:ascii="Times New Roman" w:eastAsia="Times New Roman" w:hAnsi="Times New Roman" w:cs="Times New Roman"/>
-                <w:i/>
-                <w:sz w:val="20"/>
-                <w:szCs w:val="24"/>
-                <w:color w:val="FF0000"/>
-              </w:rPr>
-              <w:t xml:space="preserve">sumber</w:t>
-            </w:r>
-            <w:r>
-              <w:rPr>
-                <w:rFonts w:ascii="Times New Roman" w:eastAsia="Times New Roman" w:hAnsi="Times New Roman" w:cs="Times New Roman"/>
-                <w:sz w:val="20"/>
-                <w:szCs w:val="24"/>
-              </w:rPr>
-              <w:t xml:space="preserve"> </w:t>
-            </w:r>
-            <w:r>
-              <w:rPr>
-                <w:rFonts w:ascii="Times New Roman" w:eastAsia="Times New Roman" w:hAnsi="Times New Roman" w:cs="Times New Roman"/>
-                <w:i/>
-                <w:sz w:val="20"/>
-                <w:szCs w:val="24"/>
-                <w:color w:val="FF0000"/>
-              </w:rPr>
-              <w:t xml:space="preserve">dan seluruh prasyarat route terbukti</w:t>
+                <w:sz w:val="20"/>
+                <w:szCs w:val="24"/>
+                <w:color w:val="FF0000"/>
+              </w:rPr>
+              <w:t xml:space="preserve">dan seluruh prasyarat jalur lanjutan terbukti</w:t>
             </w:r>
             <w:r>
               <w:rPr>
@@ -26457,7 +25849,7 @@
                 <w:szCs w:val="24"/>
                 <w:color w:val="FF0000"/>
               </w:rPr>
-              <w:t xml:space="preserve">telah terkonfirmasi dan route tercatat siap</w:t>
+              <w:t xml:space="preserve">telah terkonfirmasi dan jalur lanjutan tercatat siap</w:t>
             </w:r>
             <w:r>
               <w:rPr>
@@ -27711,7 +27103,7 @@
                 <w:szCs w:val="24"/>
                 <w:color w:val="FF0000"/>
               </w:rPr>
-              <w:t xml:space="preserve">containment</w:t>
+              <w:t xml:space="preserve">batas lingkungan pengujian</w:t>
             </w:r>
             <w:r>
               <w:rPr>
@@ -27759,7 +27151,7 @@
                 <w:szCs w:val="24"/>
                 <w:color w:val="FF0000"/>
               </w:rPr>
-              <w:t xml:space="preserve"> berdasarkan keluaran, hasil validasi, dan kejadian containment.</w:t>
+              <w:t xml:space="preserve"> berdasarkan keluaran, hasil validasi, dan pelanggaran batas lingkungan pengujian.</w:t>
             </w:r>
           </w:p>
         </w:tc>
@@ -27884,7 +27276,7 @@
                 <w:szCs w:val="24"/>
                 <w:color w:val="FF0000"/>
               </w:rPr>
-              <w:t xml:space="preserve">fallback</w:t>
+              <w:t xml:space="preserve">mekanisme cadangan</w:t>
             </w:r>
             <w:r>
               <w:rPr>
@@ -28136,7 +27528,7 @@
                 <w:szCs w:val="24"/>
                 <w:color w:val="FF0000"/>
               </w:rPr>
-              <w:t xml:space="preserve"> berdasarkan bukti output dan fallback.</w:t>
+              <w:t xml:space="preserve"> berdasarkan bukti output dan mekanisme cadangan.</w:t>
             </w:r>
           </w:p>
         </w:tc>
@@ -28947,7 +28339,7 @@
                 <w:szCs w:val="24"/>
                 <w:color w:val="FF0000"/>
               </w:rPr>
-              <w:t xml:space="preserve">provenance</w:t>
+              <w:t xml:space="preserve">catatan asal-usul</w:t>
             </w:r>
             <w:r>
               <w:rPr>
@@ -29154,7 +28546,7 @@
                 <w:szCs w:val="24"/>
                 <w:color w:val="FF0000"/>
               </w:rPr>
-              <w:t xml:space="preserve">sesuai skema tanpa retry. Alasan berbentuk teks</w:t>
+              <w:t xml:space="preserve">sesuai skema tanpa pengulangan. Alasan berbentuk teks</w:t>
             </w:r>
             <w:r>
               <w:rPr>
@@ -29392,7 +28784,7 @@
                 <w:szCs w:val="24"/>
                 <w:color w:val="FF0000"/>
               </w:rPr>
-              <w:t xml:space="preserve">dengan rujukan keputusan dan provenance lengkap serta terverifikasi</w:t>
+              <w:t xml:space="preserve">dengan rujukan keputusan dan catatan asal-usul lengkap serta terverifikasi</w:t>
             </w:r>
             <w:r>
               <w:rPr>
@@ -29693,7 +29085,27 @@
                 <w:szCs w:val="24"/>
                 <w:color w:val="FF0000"/>
               </w:rPr>
-              <w:t xml:space="preserve">generasi merujuk pada seed serta jenis mutasi yang diizinkan. Seluruh rujukan dapat ditelusuri ke input panggilan</w:t>
+              <w:t xml:space="preserve">generasi merujuk pada </w:t>
+            </w:r>
+            <w:r>
+              <w:rPr>
+                <w:rFonts w:ascii="Times New Roman" w:eastAsia="Times New Roman" w:hAnsi="Times New Roman" w:cs="Times New Roman"/>
+                <w:sz w:val="20"/>
+                <w:szCs w:val="24"/>
+                <w:color w:val="FF0000"/>
+                <w:i/>
+                <w:iCs/>
+              </w:rPr>
+              <w:t xml:space="preserve">payload</w:t>
+            </w:r>
+            <w:r>
+              <w:rPr>
+                <w:rFonts w:ascii="Times New Roman" w:eastAsia="Times New Roman" w:hAnsi="Times New Roman" w:cs="Times New Roman"/>
+                <w:sz w:val="20"/>
+                <w:szCs w:val="24"/>
+                <w:color w:val="FF0000"/>
+              </w:rPr>
+              <w:t xml:space="preserve"> awal serta jenis mutasi yang diizinkan. Seluruh rujukan dapat ditelusuri ke masukan pemanggilan model</w:t>
             </w:r>
             <w:r>
               <w:rPr>
@@ -29761,7 +29173,7 @@
                 <w:szCs w:val="24"/>
                 <w:color w:val="FF0000"/>
               </w:rPr>
-              <w:t xml:space="preserve">retry</w:t>
+              <w:t xml:space="preserve">pengulangan</w:t>
             </w:r>
             <w:r>
               <w:rPr>
@@ -29795,7 +29207,7 @@
                 <w:szCs w:val="24"/>
                 <w:color w:val="FF0000"/>
               </w:rPr>
-              <w:t xml:space="preserve">fallback</w:t>
+              <w:t xml:space="preserve">mekanisme cadangan</w:t>
             </w:r>
             <w:r>
               <w:rPr>
@@ -29858,67 +29270,39 @@
           <w:rFonts w:ascii="Times New Roman" w:hAnsi="Times New Roman" w:cs="Times New Roman"/>
           <w:color w:val="FF0000"/>
         </w:rPr>
-        <w:t xml:space="preserve">Pada Soutput, </w:t>
+        <w:t xml:space="preserve">Penilaian Soutput membedakan pengulangan untuk memperbaiki </w:t>
       </w:r>
       <w:r>
         <w:rPr>
           <w:rFonts w:ascii="Times New Roman" w:hAnsi="Times New Roman" w:cs="Times New Roman"/>
           <w:color w:val="FF0000"/>
           <w:i/>
-        </w:rPr>
-        <w:t xml:space="preserve">retry</w:t>
+          <w:iCs/>
+        </w:rPr>
+        <w:t xml:space="preserve">JSON</w:t>
       </w:r>
       <w:r>
         <w:rPr>
           <w:rFonts w:ascii="Times New Roman" w:hAnsi="Times New Roman" w:cs="Times New Roman"/>
           <w:color w:val="FF0000"/>
         </w:rPr>
-        <w:t xml:space="preserve"> untuk memperbaiki JSON atau struktur keluaran dibedakan dari </w:t>
+        <w:t xml:space="preserve"> atau struktur keluaran dari pengulangan akibat gangguan komunikasi atau pembatasan laju permintaan oleh penyedia. Respons HTTP 429 yang berhasil dipulihkan tidak dengan sendirinya menunjukkan kesalahan keluaran model dan tidak menjadi dasar pemberian skor untuk keluaran yang memerlukan perbaikan. Penanganan </w:t>
       </w:r>
       <w:r>
         <w:rPr>
           <w:rFonts w:ascii="Times New Roman" w:hAnsi="Times New Roman" w:cs="Times New Roman"/>
           <w:color w:val="FF0000"/>
           <w:i/>
-        </w:rPr>
-        <w:t xml:space="preserve">retry</w:t>
+          <w:iCs/>
+        </w:rPr>
+        <w:t xml:space="preserve">guardrail</w:t>
       </w:r>
       <w:r>
         <w:rPr>
           <w:rFonts w:ascii="Times New Roman" w:hAnsi="Times New Roman" w:cs="Times New Roman"/>
           <w:color w:val="FF0000"/>
         </w:rPr>
-        <w:t xml:space="preserve"> transport akibat batas laju penyedia. Respons HTTP 429 yang pulih tidak dengan sendirinya berarti keluaran model rusak atau mendapat skor keluaran yang diperbaiki. Penanganan </w:t>
-      </w:r>
-      <w:r>
-        <w:rPr>
-          <w:rFonts w:ascii="Times New Roman" w:hAnsi="Times New Roman" w:cs="Times New Roman"/>
-          <w:color w:val="FF0000"/>
-          <w:i/>
-        </w:rPr>
-        <w:t xml:space="preserve">guardrail</w:t>
-      </w:r>
-      <w:r>
-        <w:rPr>
-          <w:rFonts w:ascii="Times New Roman" w:hAnsi="Times New Roman" w:cs="Times New Roman"/>
-          <w:color w:val="FF0000"/>
-        </w:rPr>
-        <w:t xml:space="preserve"> tetap dicatat terpisah dari </w:t>
-      </w:r>
-      <w:r>
-        <w:rPr>
-          <w:rFonts w:ascii="Times New Roman" w:hAnsi="Times New Roman" w:cs="Times New Roman"/>
-          <w:color w:val="FF0000"/>
-          <w:i/>
-        </w:rPr>
-        <w:t xml:space="preserve">retry</w:t>
-      </w:r>
-      <w:r>
-        <w:rPr>
-          <w:rFonts w:ascii="Times New Roman" w:hAnsi="Times New Roman" w:cs="Times New Roman"/>
-          <w:color w:val="FF0000"/>
-        </w:rPr>
-        <w:t xml:space="preserve"> transport.</w:t>
+        <w:t xml:space="preserve"> dicatat secara terpisah dari pengulangan akibat gangguan komunikasi.</w:t>
       </w:r>
     </w:p>
     <w:p>
@@ -29934,157 +29318,7 @@
           <w:rFonts w:ascii="Times New Roman" w:hAnsi="Times New Roman" w:cs="Times New Roman"/>
           <w:color w:val="FF0000"/>
         </w:rPr>
-        <w:t xml:space="preserve">Soutput dinilai dalam konteks metode final dari bukti panggilan model, </w:t>
-      </w:r>
-      <w:r>
-        <w:rPr>
-          <w:rFonts w:ascii="Times New Roman" w:hAnsi="Times New Roman" w:cs="Times New Roman"/>
-          <w:color w:val="FF0000"/>
-          <w:i/>
-        </w:rPr>
-        <w:t xml:space="preserve">parsing</w:t>
-      </w:r>
-      <w:r>
-        <w:rPr>
-          <w:rFonts w:ascii="Times New Roman" w:hAnsi="Times New Roman" w:cs="Times New Roman"/>
-          <w:color w:val="FF0000"/>
-        </w:rPr>
-        <w:t xml:space="preserve">, validasi, perbaikan, </w:t>
-      </w:r>
-      <w:r>
-        <w:rPr>
-          <w:rFonts w:ascii="Times New Roman" w:hAnsi="Times New Roman" w:cs="Times New Roman"/>
-          <w:color w:val="FF0000"/>
-          <w:i/>
-        </w:rPr>
-        <w:t xml:space="preserve">fallback</w:t>
-      </w:r>
-      <w:r>
-        <w:rPr>
-          <w:rFonts w:ascii="Times New Roman" w:hAnsi="Times New Roman" w:cs="Times New Roman"/>
-          <w:color w:val="FF0000"/>
-        </w:rPr>
-        <w:t xml:space="preserve">, dan </w:t>
-      </w:r>
-      <w:r>
-        <w:rPr>
-          <w:rFonts w:ascii="Times New Roman" w:hAnsi="Times New Roman" w:cs="Times New Roman"/>
-          <w:color w:val="FF0000"/>
-          <w:i/>
-        </w:rPr>
-        <w:t xml:space="preserve">containment</w:t>
-      </w:r>
-      <w:r>
-        <w:rPr>
-          <w:rFonts w:ascii="Times New Roman" w:hAnsi="Times New Roman" w:cs="Times New Roman"/>
-          <w:color w:val="FF0000"/>
-        </w:rPr>
-        <w:t xml:space="preserve">. Panggilan evaluator dan metode lain dikecualikan, kecuali kejadian yang secara eksplisit memiliki </w:t>
-      </w:r>
-      <w:r>
-        <w:rPr>
-          <w:rFonts w:ascii="Times New Roman" w:hAnsi="Times New Roman" w:cs="Times New Roman"/>
-          <w:color w:val="FF0000"/>
-          <w:i/>
-        </w:rPr>
-        <w:t xml:space="preserve">scope</w:t>
-      </w:r>
-      <w:r>
-        <w:rPr>
-          <w:rFonts w:ascii="Times New Roman" w:hAnsi="Times New Roman" w:cs="Times New Roman"/>
-          <w:color w:val="FF0000"/>
-        </w:rPr>
-        <w:t xml:space="preserve"> </w:t>
-      </w:r>
-      <w:r>
-        <w:rPr>
-          <w:rFonts w:ascii="Times New Roman" w:hAnsi="Times New Roman" w:cs="Times New Roman"/>
-          <w:color w:val="FF0000"/>
-          <w:i/>
-        </w:rPr>
-        <w:t xml:space="preserve">run</w:t>
-      </w:r>
-      <w:r>
-        <w:rPr>
-          <w:rFonts w:ascii="Times New Roman" w:hAnsi="Times New Roman" w:cs="Times New Roman"/>
-          <w:color w:val="FF0000"/>
-        </w:rPr>
-        <w:t xml:space="preserve">. Stabilitas </w:t>
-      </w:r>
-      <w:r>
-        <w:rPr>
-          <w:rFonts w:ascii="Times New Roman" w:hAnsi="Times New Roman" w:cs="Times New Roman"/>
-          <w:color w:val="FF0000"/>
-          <w:i/>
-        </w:rPr>
-        <w:t xml:space="preserve">output</w:t>
-      </w:r>
-      <w:r>
-        <w:rPr>
-          <w:rFonts w:ascii="Times New Roman" w:hAnsi="Times New Roman" w:cs="Times New Roman"/>
-          <w:color w:val="FF0000"/>
-        </w:rPr>
-        <w:t xml:space="preserve"> antar repetisi dihitung dari frekuensi nilai Soutput yang paling sering muncul dibagi jumlah repetisi final yang dapat dinilai; </w:t>
-      </w:r>
-      <w:r>
-        <w:rPr>
-          <w:rFonts w:ascii="Times New Roman" w:hAnsi="Times New Roman" w:cs="Times New Roman"/>
-          <w:color w:val="FF0000"/>
-          <w:i/>
-        </w:rPr>
-        <w:t xml:space="preserve">n_final</w:t>
-      </w:r>
-      <w:r>
-        <w:rPr>
-          <w:rFonts w:ascii="Times New Roman" w:hAnsi="Times New Roman" w:cs="Times New Roman"/>
-          <w:color w:val="FF0000"/>
-        </w:rPr>
-        <w:t xml:space="preserve">, </w:t>
-      </w:r>
-      <w:r>
-        <w:rPr>
-          <w:rFonts w:ascii="Times New Roman" w:hAnsi="Times New Roman" w:cs="Times New Roman"/>
-          <w:color w:val="FF0000"/>
-          <w:i/>
-        </w:rPr>
-        <w:t xml:space="preserve">n_pending</w:t>
-      </w:r>
-      <w:r>
-        <w:rPr>
-          <w:rFonts w:ascii="Times New Roman" w:hAnsi="Times New Roman" w:cs="Times New Roman"/>
-          <w:color w:val="FF0000"/>
-        </w:rPr>
-        <w:t xml:space="preserve">, dan </w:t>
-      </w:r>
-      <w:r>
-        <w:rPr>
-          <w:rFonts w:ascii="Times New Roman" w:hAnsi="Times New Roman" w:cs="Times New Roman"/>
-          <w:color w:val="FF0000"/>
-          <w:i/>
-        </w:rPr>
-        <w:t xml:space="preserve">n_planned</w:t>
-      </w:r>
-      <w:r>
-        <w:rPr>
-          <w:rFonts w:ascii="Times New Roman" w:hAnsi="Times New Roman" w:cs="Times New Roman"/>
-          <w:color w:val="FF0000"/>
-        </w:rPr>
-        <w:t xml:space="preserve"> dilaporkan terpisah. Satu repetisi menghasilkan null. Ukuran ini berbeda dari </w:t>
-      </w:r>
-      <w:r>
-        <w:rPr>
-          <w:rFonts w:ascii="Times New Roman" w:hAnsi="Times New Roman" w:cs="Times New Roman"/>
-          <w:color w:val="FF0000"/>
-          <w:i/>
-        </w:rPr>
-        <w:t xml:space="preserve">consistency_score</w:t>
-      </w:r>
-      <w:r>
-        <w:rPr>
-          <w:rFonts w:ascii="Times New Roman" w:hAnsi="Times New Roman" w:cs="Times New Roman"/>
-          <w:color w:val="FF0000"/>
-        </w:rPr>
-        <w:t xml:space="preserve"> vektor lengkap.</w:t>
+        <w:t xml:space="preserve">Soutput dinilai pada metode terakhir berdasarkan rekaman pemanggilan model, pembacaan dan validasi keluaran, perbaikan, penggunaan mekanisme cadangan, serta kepatuhan terhadap batas lingkungan pengujian. Pemanggilan model penilai dan metode lain tidak disertakan, kecuali untuk kejadian yang secara eksplisit berlaku pada keseluruhan eksekusi. Stabilitas keluaran antar pengulangan dihitung dari frekuensi skor Soutput yang paling sering muncul, dibagi jumlah pengulangan yang telah selesai dinilai. Jumlah pengulangan yang telah dinilai, masih menunggu penilaian, dan direncanakan dilaporkan secara terpisah. Ukuran stabilitas belum dapat dihitung jika hanya tersedia satu pengulangan. Ukuran ini berbeda dari konsistensi yang dihitung berdasarkan keseluruhan komponen skor.</w:t>
       </w:r>
     </w:p>
     <w:p>
@@ -30371,52 +29605,7 @@
           <w:rFonts w:ascii="Times New Roman" w:hAnsi="Times New Roman" w:cs="Times New Roman"/>
           <w:color w:val="FF0000"/>
         </w:rPr>
-        <w:t xml:space="preserve">yang sesuai dengan metrik dan bukti yang dapat dinilai; penyebut aktual dinyatakan untuk masing-masing metrik. Jumlah yang dapat dinilai, </w:t>
-      </w:r>
-      <w:r>
-        <w:rPr>
-          <w:rFonts w:ascii="Times New Roman" w:hAnsi="Times New Roman" w:cs="Times New Roman"/>
-          <w:color w:val="FF0000"/>
-          <w:i/>
-        </w:rPr>
-        <w:t xml:space="preserve">pending</w:t>
-      </w:r>
-      <w:r>
-        <w:rPr>
-          <w:rFonts w:ascii="Times New Roman" w:hAnsi="Times New Roman" w:cs="Times New Roman"/>
-          <w:color w:val="FF0000"/>
-        </w:rPr>
-        <w:t xml:space="preserve"> atau </w:t>
-      </w:r>
-      <w:r>
-        <w:rPr>
-          <w:rFonts w:ascii="Times New Roman" w:hAnsi="Times New Roman" w:cs="Times New Roman"/>
-          <w:color w:val="FF0000"/>
-          <w:i/>
-        </w:rPr>
-        <w:t xml:space="preserve">unassessable</w:t>
-      </w:r>
-      <w:r>
-        <w:rPr>
-          <w:rFonts w:ascii="Times New Roman" w:hAnsi="Times New Roman" w:cs="Times New Roman"/>
-          <w:color w:val="FF0000"/>
-        </w:rPr>
-        <w:t xml:space="preserve">, dan </w:t>
-      </w:r>
-      <w:r>
-        <w:rPr>
-          <w:rFonts w:ascii="Times New Roman" w:hAnsi="Times New Roman" w:cs="Times New Roman"/>
-          <w:color w:val="FF0000"/>
-          <w:i/>
-        </w:rPr>
-        <w:t xml:space="preserve">not_applicable</w:t>
-      </w:r>
-      <w:r>
-        <w:rPr>
-          <w:rFonts w:ascii="Times New Roman" w:hAnsi="Times New Roman" w:cs="Times New Roman"/>
-          <w:color w:val="FF0000"/>
-        </w:rPr>
-        <w:t xml:space="preserve"> beserta alasannya dilaporkan secara terpisah. Nilai null tidak diubah menjadi nol atau dihilangkan tanpa penjelasan</w:t>
+        <w:t xml:space="preserve">yang sesuai dengan definisi metrik dan bukti yang tersedia. Penyebut aktual dinyatakan untuk setiap metrik. Jumlah hasil yang dapat dinilai, masih menunggu penilaian, belum dapat dinilai, dan tidak berlaku dilaporkan secara terpisah beserta alasannya. Nilai yang belum tersedia tidak diganti dengan nol atau dihilangkan tanpa penjelasan</w:t>
       </w:r>
       <w:r>
         <w:rPr>
@@ -31475,37 +30664,7 @@
           <w:rFonts w:ascii="Times New Roman" w:hAnsi="Times New Roman" w:cs="Times New Roman"/>
           <w:color w:val="FF0000"/>
         </w:rPr>
-        <w:t xml:space="preserve">manusia atau </w:t>
-      </w:r>
-      <w:r>
-        <w:rPr>
-          <w:rFonts w:ascii="Times New Roman" w:hAnsi="Times New Roman" w:cs="Times New Roman"/>
-          <w:color w:val="FF0000"/>
-          <w:i/>
-        </w:rPr>
-        <w:t xml:space="preserve">AI</w:t>
-      </w:r>
-      <w:r>
-        <w:rPr>
-          <w:rFonts w:ascii="Times New Roman" w:hAnsi="Times New Roman" w:cs="Times New Roman"/>
-          <w:color w:val="FF0000"/>
-        </w:rPr>
-        <w:t xml:space="preserve"> sesuai </w:t>
-      </w:r>
-      <w:r>
-        <w:rPr>
-          <w:rFonts w:ascii="Times New Roman" w:hAnsi="Times New Roman" w:cs="Times New Roman"/>
-          <w:color w:val="FF0000"/>
-          <w:i/>
-        </w:rPr>
-        <w:t xml:space="preserve">workflow</w:t>
-      </w:r>
-      <w:r>
-        <w:rPr>
-          <w:rFonts w:ascii="Times New Roman" w:hAnsi="Times New Roman" w:cs="Times New Roman"/>
-          <w:color w:val="FF0000"/>
-        </w:rPr>
-        <w:t xml:space="preserve"> yang dibekukan</w:t>
+        <w:t xml:space="preserve">manusia atau AI sesuai prosedur yang ditetapkan sebelum eksperimen</w:t>
       </w:r>
       <w:r>
         <w:rPr>
@@ -31755,37 +30914,7 @@
           <w:rFonts w:ascii="Times New Roman" w:hAnsi="Times New Roman" w:cs="Times New Roman"/>
           <w:color w:val="FF0000"/>
         </w:rPr>
-        <w:t xml:space="preserve">. Pada eksperimen utama model memilih metode, sehingga metode terpilih merupakan hasil pengamatan, bukan faktor pengali jumlah </w:t>
-      </w:r>
-      <w:r>
-        <w:rPr>
-          <w:rFonts w:ascii="Times New Roman" w:hAnsi="Times New Roman" w:cs="Times New Roman"/>
-          <w:color w:val="FF0000"/>
-          <w:i/>
-        </w:rPr>
-        <w:t xml:space="preserve">run</w:t>
-      </w:r>
-      <w:r>
-        <w:rPr>
-          <w:rFonts w:ascii="Times New Roman" w:hAnsi="Times New Roman" w:cs="Times New Roman"/>
-          <w:color w:val="FF0000"/>
-        </w:rPr>
-        <w:t xml:space="preserve">. Penetapan </w:t>
-      </w:r>
-      <w:r>
-        <w:rPr>
-          <w:rFonts w:ascii="Times New Roman" w:hAnsi="Times New Roman" w:cs="Times New Roman"/>
-          <w:color w:val="FF0000"/>
-          <w:i/>
-        </w:rPr>
-        <w:t xml:space="preserve">target_method</w:t>
-      </w:r>
-      <w:r>
-        <w:rPr>
-          <w:rFonts w:ascii="Times New Roman" w:hAnsi="Times New Roman" w:cs="Times New Roman"/>
-          <w:color w:val="FF0000"/>
-        </w:rPr>
-        <w:t xml:space="preserve"> secara manual hanya digunakan untuk pengujian atau diagnostik dan tidak membuktikan kemampuan model memilih metode secara mandiri</w:t>
+        <w:t xml:space="preserve">. Pada eksperimen utama, metode dipilih oleh model dan dicatat sebagai hasil pengamatan sehingga tidak menambah faktor pengali jumlah eksekusi. Penetapan metode secara manual hanya digunakan untuk pemeriksaan atau diagnostik. Hasilnya tidak digunakan sebagai bukti kemampuan model dalam memilih metode secara mandiri</w:t>
       </w:r>
       <w:r>
         <w:rPr>
@@ -33630,13 +32759,6 @@
       <w:r>
         <w:rPr>
           <w:rFonts w:ascii="Times New Roman" w:hAnsi="Times New Roman" w:cs="Times New Roman"/>
-          <w:color w:val="FF0000"/>
-        </w:rPr>
-        <w:t xml:space="preserve">pada scoring_reason </w:t>
-      </w:r>
-      <w:r>
-        <w:rPr>
-          <w:rFonts w:ascii="Times New Roman" w:hAnsi="Times New Roman" w:cs="Times New Roman"/>
         </w:rPr>
         <w:t xml:space="preserve">dicatat </w:t>
       </w:r>
@@ -33793,112 +32915,7 @@
           <w:rFonts w:ascii="Times New Roman" w:hAnsi="Times New Roman" w:cs="Times New Roman"/>
           <w:color w:val="FF0000"/>
         </w:rPr>
-        <w:t xml:space="preserve">Pilihan </w:t>
-      </w:r>
-      <w:r>
-        <w:rPr>
-          <w:rFonts w:ascii="Times New Roman" w:hAnsi="Times New Roman" w:cs="Times New Roman"/>
-          <w:color w:val="FF0000"/>
-          <w:i/>
-        </w:rPr>
-        <w:t xml:space="preserve">human</w:t>
-      </w:r>
-      <w:r>
-        <w:rPr>
-          <w:rFonts w:ascii="Times New Roman" w:hAnsi="Times New Roman" w:cs="Times New Roman"/>
-          <w:color w:val="FF0000"/>
-        </w:rPr>
-        <w:t xml:space="preserve">, </w:t>
-      </w:r>
-      <w:r>
-        <w:rPr>
-          <w:rFonts w:ascii="Times New Roman" w:hAnsi="Times New Roman" w:cs="Times New Roman"/>
-          <w:color w:val="FF0000"/>
-          <w:i/>
-        </w:rPr>
-        <w:t xml:space="preserve">ai</w:t>
-      </w:r>
-      <w:r>
-        <w:rPr>
-          <w:rFonts w:ascii="Times New Roman" w:hAnsi="Times New Roman" w:cs="Times New Roman"/>
-          <w:color w:val="FF0000"/>
-        </w:rPr>
-        <w:t xml:space="preserve">, atau </w:t>
-      </w:r>
-      <w:r>
-        <w:rPr>
-          <w:rFonts w:ascii="Times New Roman" w:hAnsi="Times New Roman" w:cs="Times New Roman"/>
-          <w:color w:val="FF0000"/>
-          <w:i/>
-        </w:rPr>
-        <w:t xml:space="preserve">both</w:t>
-      </w:r>
-      <w:r>
-        <w:rPr>
-          <w:rFonts w:ascii="Times New Roman" w:hAnsi="Times New Roman" w:cs="Times New Roman"/>
-          <w:color w:val="FF0000"/>
-        </w:rPr>
-        <w:t xml:space="preserve"> ditetapkan sebelum eksekusi. Pada </w:t>
-      </w:r>
-      <w:r>
-        <w:rPr>
-          <w:rFonts w:ascii="Times New Roman" w:hAnsi="Times New Roman" w:cs="Times New Roman"/>
-          <w:color w:val="FF0000"/>
-          <w:i/>
-        </w:rPr>
-        <w:t xml:space="preserve">both</w:t>
-      </w:r>
-      <w:r>
-        <w:rPr>
-          <w:rFonts w:ascii="Times New Roman" w:hAnsi="Times New Roman" w:cs="Times New Roman"/>
-          <w:color w:val="FF0000"/>
-        </w:rPr>
-        <w:t xml:space="preserve">, satu eksekusi menghasilkan hasil penilaian manusia dan </w:t>
-      </w:r>
-      <w:r>
-        <w:rPr>
-          <w:rFonts w:ascii="Times New Roman" w:hAnsi="Times New Roman" w:cs="Times New Roman"/>
-          <w:color w:val="FF0000"/>
-          <w:i/>
-        </w:rPr>
-        <w:t xml:space="preserve">AI</w:t>
-      </w:r>
-      <w:r>
-        <w:rPr>
-          <w:rFonts w:ascii="Times New Roman" w:hAnsi="Times New Roman" w:cs="Times New Roman"/>
-          <w:color w:val="FF0000"/>
-        </w:rPr>
-        <w:t xml:space="preserve"> yang independen, masing-masing dengan vektor komponen dan </w:t>
-      </w:r>
-      <w:r>
-        <w:rPr>
-          <w:rFonts w:ascii="Times New Roman" w:hAnsi="Times New Roman" w:cs="Times New Roman"/>
-          <w:color w:val="FF0000"/>
-          <w:i/>
-        </w:rPr>
-        <w:t xml:space="preserve">Srun_final</w:t>
-      </w:r>
-      <w:r>
-        <w:rPr>
-          <w:rFonts w:ascii="Times New Roman" w:hAnsi="Times New Roman" w:cs="Times New Roman"/>
-          <w:color w:val="FF0000"/>
-        </w:rPr>
-        <w:t xml:space="preserve"> sendiri. Penghitungan memakai presisi penuh dan hanya skor akhir dibulatkan sampai empat angka desimal. Contoh vektor (4,4,4,4,4) menghasilkan 4.0000; (4,3,3,0,4) menghasilkan 3.1000; dan (3,2,2,1,3) menghasilkan 2.3000. Penilaian wajib yang belum lengkap menghasilkan </w:t>
-      </w:r>
-      <w:r>
-        <w:rPr>
-          <w:rFonts w:ascii="Times New Roman" w:hAnsi="Times New Roman" w:cs="Times New Roman"/>
-          <w:color w:val="FF0000"/>
-          <w:i/>
-        </w:rPr>
-        <w:t xml:space="preserve">null/pending</w:t>
-      </w:r>
-      <w:r>
-        <w:rPr>
-          <w:rFonts w:ascii="Times New Roman" w:hAnsi="Times New Roman" w:cs="Times New Roman"/>
-          <w:color w:val="FF0000"/>
-        </w:rPr>
-        <w:t xml:space="preserve">.</w:t>
+        <w:t xml:space="preserve">Penilaian oleh manusia, AI, atau keduanya ditetapkan sebelum eksekusi. Apabila keduanya digunakan, manusia dan AI menilai eksekusi yang sama secara independen. Masing-masing menghasilkan susunan skor komponen dan nilai akhir Srun tersendiri. Perhitungan menggunakan presisi penuh, kemudian skor akhir dibulatkan hingga empat angka desimal. Sebagai contoh, susunan skor (4,4,4,4,4) menghasilkan 4.0000; (4,3,3,0,4) menghasilkan 3.1000; dan (3,2,2,1,3) menghasilkan 2.3000. Skor akhir belum diterbitkan apabila penilaian yang diwajibkan belum lengkap.</w:t>
       </w:r>
     </w:p>
     <w:p>
@@ -33913,76 +32930,8 @@
         <w:rPr>
           <w:rFonts w:ascii="Times New Roman" w:hAnsi="Times New Roman" w:cs="Times New Roman"/>
           <w:color w:val="FF0000"/>
-          <w:i/>
-        </w:rPr>
-        <w:t xml:space="preserve">Receipt</w:t>
-      </w:r>
-      <w:r>
-        <w:rPr>
-          <w:rFonts w:ascii="Times New Roman" w:hAnsi="Times New Roman" w:cs="Times New Roman"/>
-          <w:color w:val="FF0000"/>
-        </w:rPr>
-        <w:t xml:space="preserve"> </w:t>
-      </w:r>
-      <w:r>
-        <w:rPr>
-          <w:rFonts w:ascii="Times New Roman" w:hAnsi="Times New Roman" w:cs="Times New Roman"/>
-          <w:color w:val="FF0000"/>
-          <w:i/>
-        </w:rPr>
-        <w:t xml:space="preserve">human-verified</w:t>
-      </w:r>
-      <w:r>
-        <w:rPr>
-          <w:rFonts w:ascii="Times New Roman" w:hAnsi="Times New Roman" w:cs="Times New Roman"/>
-          <w:color w:val="FF0000"/>
-        </w:rPr>
-        <w:t xml:space="preserve"> dan </w:t>
-      </w:r>
-      <w:r>
-        <w:rPr>
-          <w:rFonts w:ascii="Times New Roman" w:hAnsi="Times New Roman" w:cs="Times New Roman"/>
-          <w:color w:val="FF0000"/>
-          <w:i/>
-        </w:rPr>
-        <w:t xml:space="preserve">ai-verified</w:t>
-      </w:r>
-      <w:r>
-        <w:rPr>
-          <w:rFonts w:ascii="Times New Roman" w:hAnsi="Times New Roman" w:cs="Times New Roman"/>
-          <w:color w:val="FF0000"/>
-        </w:rPr>
-        <w:t xml:space="preserve"> disimpan terpisah dan memuat identitas </w:t>
-      </w:r>
-      <w:r>
-        <w:rPr>
-          <w:rFonts w:ascii="Times New Roman" w:hAnsi="Times New Roman" w:cs="Times New Roman"/>
-          <w:color w:val="FF0000"/>
-          <w:i/>
-        </w:rPr>
-        <w:t xml:space="preserve">run</w:t>
-      </w:r>
-      <w:r>
-        <w:rPr>
-          <w:rFonts w:ascii="Times New Roman" w:hAnsi="Times New Roman" w:cs="Times New Roman"/>
-          <w:color w:val="FF0000"/>
-        </w:rPr>
-        <w:t xml:space="preserve"> dan eksekusi, hash SHA-256 artefak sumber, versi rubrik, kandidat dan rujukan bukti, alasan, identitas penilai, waktu, vektor skor, serta formula. Koreksi ditambahkan sebagai catatan baru dengan </w:t>
-      </w:r>
-      <w:r>
-        <w:rPr>
-          <w:rFonts w:ascii="Times New Roman" w:hAnsi="Times New Roman" w:cs="Times New Roman"/>
-          <w:color w:val="FF0000"/>
-          <w:i/>
-        </w:rPr>
-        <w:t xml:space="preserve">supersedes</w:t>
-      </w:r>
-      <w:r>
-        <w:rPr>
-          <w:rFonts w:ascii="Times New Roman" w:hAnsi="Times New Roman" w:cs="Times New Roman"/>
-          <w:color w:val="FF0000"/>
-        </w:rPr>
-        <w:t xml:space="preserve"> yang merujuk catatan sebelumnya; artefak sumber dan penilaian terdahulu tidak ditimpa. Pengulangan dibandingkan berdasarkan konfigurasi dan bukti yang sepadan.</w:t>
+        </w:rPr>
+        <w:t xml:space="preserve">Hasil verifikasi manusia dan AI disimpan dalam catatan yang terpisah. Setiap catatan memuat identitas pengujian dan eksekusi, nilai hash SHA-256 artefak sumber, versi rubrik, identitas kandidat, rujukan bukti, alasan penilaian, identitas penilai, waktu penilaian, susunan skor, dan rumus yang digunakan. Jika diperlukan koreksi, dibuat catatan baru yang merujuk pada penilaian sebelumnya. Artefak sumber dan catatan terdahulu tetap disimpan agar perubahan dapat ditelusuri. Perbandingan antar pengulangan menggunakan konfigurasi dan bukti yang sepadan.</w:t>
       </w:r>
     </w:p>
     <w:p>
@@ -33998,97 +32947,23 @@
           <w:rFonts w:ascii="Times New Roman" w:hAnsi="Times New Roman" w:cs="Times New Roman"/>
           <w:color w:val="FF0000"/>
         </w:rPr>
-        <w:t xml:space="preserve">Evaluator </w:t>
+        <w:t xml:space="preserve">AI penilai menggunakan konfigurasi yang ditetapkan sebelum eksekusi dan konteks percakapan baru tanpa akses ke perangkat pengujian DVWA. Pada konfigurasi terdahulu yang telah didokumentasikan, penilaian menggunakan model deepseek-v4.1-flash melalui layanan yang kompatibel dengan OpenAI, dengan </w:t>
       </w:r>
       <w:r>
         <w:rPr>
           <w:rFonts w:ascii="Times New Roman" w:hAnsi="Times New Roman" w:cs="Times New Roman"/>
           <w:color w:val="FF0000"/>
           <w:i/>
-        </w:rPr>
-        <w:t xml:space="preserve">AI</w:t>
+          <w:iCs/>
+        </w:rPr>
+        <w:t xml:space="preserve">temperature</w:t>
       </w:r>
       <w:r>
         <w:rPr>
           <w:rFonts w:ascii="Times New Roman" w:hAnsi="Times New Roman" w:cs="Times New Roman"/>
           <w:color w:val="FF0000"/>
         </w:rPr>
-        <w:t xml:space="preserve"> menggunakan profil yang dibekukan sebelum eksekusi dan konteks baru tanpa akses ke </w:t>
-      </w:r>
-      <w:r>
-        <w:rPr>
-          <w:rFonts w:ascii="Times New Roman" w:hAnsi="Times New Roman" w:cs="Times New Roman"/>
-          <w:color w:val="FF0000"/>
-          <w:i/>
-        </w:rPr>
-        <w:t xml:space="preserve">tools</w:t>
-      </w:r>
-      <w:r>
-        <w:rPr>
-          <w:rFonts w:ascii="Times New Roman" w:hAnsi="Times New Roman" w:cs="Times New Roman"/>
-          <w:color w:val="FF0000"/>
-        </w:rPr>
-        <w:t xml:space="preserve"> DVWA. Dalam </w:t>
-      </w:r>
-      <w:r>
-        <w:rPr>
-          <w:rFonts w:ascii="Times New Roman" w:hAnsi="Times New Roman" w:cs="Times New Roman"/>
-          <w:color w:val="FF0000"/>
-          <w:i/>
-        </w:rPr>
-        <w:t xml:space="preserve">setup</w:t>
-      </w:r>
-      <w:r>
-        <w:rPr>
-          <w:rFonts w:ascii="Times New Roman" w:hAnsi="Times New Roman" w:cs="Times New Roman"/>
-          <w:color w:val="FF0000"/>
-        </w:rPr>
-        <w:t xml:space="preserve"> historis yang terdokumentasi, evaluator openai_compatible/deepseek-v4.1-flash menggunakan </w:t>
-      </w:r>
-      <w:r>
-        <w:rPr>
-          <w:rFonts w:ascii="Times New Roman" w:hAnsi="Times New Roman" w:cs="Times New Roman"/>
-          <w:color w:val="FF0000"/>
-          <w:i/>
-        </w:rPr>
-        <w:t xml:space="preserve">temperature</w:t>
-      </w:r>
-      <w:r>
-        <w:rPr>
-          <w:rFonts w:ascii="Times New Roman" w:hAnsi="Times New Roman" w:cs="Times New Roman"/>
-          <w:color w:val="FF0000"/>
-        </w:rPr>
-        <w:t xml:space="preserve"> 0, batas 1024 token </w:t>
-      </w:r>
-      <w:r>
-        <w:rPr>
-          <w:rFonts w:ascii="Times New Roman" w:hAnsi="Times New Roman" w:cs="Times New Roman"/>
-          <w:color w:val="FF0000"/>
-          <w:i/>
-        </w:rPr>
-        <w:t xml:space="preserve">output</w:t>
-      </w:r>
-      <w:r>
-        <w:rPr>
-          <w:rFonts w:ascii="Times New Roman" w:hAnsi="Times New Roman" w:cs="Times New Roman"/>
-          <w:color w:val="FF0000"/>
-        </w:rPr>
-        <w:t xml:space="preserve">, </w:t>
-      </w:r>
-      <w:r>
-        <w:rPr>
-          <w:rFonts w:ascii="Times New Roman" w:hAnsi="Times New Roman" w:cs="Times New Roman"/>
-          <w:color w:val="FF0000"/>
-          <w:i/>
-        </w:rPr>
-        <w:t xml:space="preserve">timeout</w:t>
-      </w:r>
-      <w:r>
-        <w:rPr>
-          <w:rFonts w:ascii="Times New Roman" w:hAnsi="Times New Roman" w:cs="Times New Roman"/>
-          <w:color w:val="FF0000"/>
-        </w:rPr>
-        <w:t xml:space="preserve"> 60 detik, dan maksimal dua percobaan per kandidat positif. Model yang sama digunakan untuk eksperimen dan penilaian dalam peran terpisah; keterbatasan tidak adanya pembanding model independen perlu dicatat. Identitas dan parameter evaluator untuk eksperimen lain ditentukan oleh konfigurasi yang dibekukan pada epoch tersebut, bukan diasumsikan sama.</w:t>
+        <w:t xml:space="preserve"> 0, batas keluaran 1024 token, batas waktu 60 detik, serta maksimal dua percobaan untuk setiap kandidat dengan sinyal positif. Model yang sama digunakan sebagai penguji dan penilai dengan peran yang terpisah. Penggunaan ini dicatat sebagai keterbatasan karena belum melibatkan model pembanding yang independen. Untuk eksperimen lain, model penilai dan parameternya mengikuti konfigurasi yang ditetapkan pada periode pengujian tersebut.</w:t>
       </w:r>
     </w:p>
     <w:p>
@@ -34104,67 +32979,23 @@
           <w:rFonts w:ascii="Times New Roman" w:hAnsi="Times New Roman" w:cs="Times New Roman"/>
           <w:color w:val="FF0000"/>
         </w:rPr>
-        <w:t xml:space="preserve">Penolakan evaluator, JSON tidak valid, sitasi yang tidak tersedia, atau </w:t>
+        <w:t xml:space="preserve">Penilaian AI ditunda apabila model penilai menolak permintaan, menghasilkan </w:t>
       </w:r>
       <w:r>
         <w:rPr>
           <w:rFonts w:ascii="Times New Roman" w:hAnsi="Times New Roman" w:cs="Times New Roman"/>
           <w:color w:val="FF0000"/>
           <w:i/>
-        </w:rPr>
-        <w:t xml:space="preserve">timeout</w:t>
+          <w:iCs/>
+        </w:rPr>
+        <w:t xml:space="preserve">JSON</w:t>
       </w:r>
       <w:r>
         <w:rPr>
           <w:rFonts w:ascii="Times New Roman" w:hAnsi="Times New Roman" w:cs="Times New Roman"/>
           <w:color w:val="FF0000"/>
         </w:rPr>
-        <w:t xml:space="preserve"> membuat penilaian </w:t>
-      </w:r>
-      <w:r>
-        <w:rPr>
-          <w:rFonts w:ascii="Times New Roman" w:hAnsi="Times New Roman" w:cs="Times New Roman"/>
-          <w:color w:val="FF0000"/>
-          <w:i/>
-        </w:rPr>
-        <w:t xml:space="preserve">AI</w:t>
-      </w:r>
-      <w:r>
-        <w:rPr>
-          <w:rFonts w:ascii="Times New Roman" w:hAnsi="Times New Roman" w:cs="Times New Roman"/>
-          <w:color w:val="FF0000"/>
-        </w:rPr>
-        <w:t xml:space="preserve"> terkait tetap </w:t>
-      </w:r>
-      <w:r>
-        <w:rPr>
-          <w:rFonts w:ascii="Times New Roman" w:hAnsi="Times New Roman" w:cs="Times New Roman"/>
-          <w:color w:val="FF0000"/>
-          <w:i/>
-        </w:rPr>
-        <w:t xml:space="preserve">pending</w:t>
-      </w:r>
-      <w:r>
-        <w:rPr>
-          <w:rFonts w:ascii="Times New Roman" w:hAnsi="Times New Roman" w:cs="Times New Roman"/>
-          <w:color w:val="FF0000"/>
-        </w:rPr>
-        <w:t xml:space="preserve">. Telemetri penilaian mencatat percobaan dan kejadian tersebut secara terpisah dari Soutput model penguji. Hasil evaluator tidak menggantikan </w:t>
-      </w:r>
-      <w:r>
-        <w:rPr>
-          <w:rFonts w:ascii="Times New Roman" w:hAnsi="Times New Roman" w:cs="Times New Roman"/>
-          <w:color w:val="FF0000"/>
-          <w:i/>
-        </w:rPr>
-        <w:t xml:space="preserve">oracle</w:t>
-      </w:r>
-      <w:r>
-        <w:rPr>
-          <w:rFonts w:ascii="Times New Roman" w:hAnsi="Times New Roman" w:cs="Times New Roman"/>
-          <w:color w:val="FF0000"/>
-        </w:rPr>
-        <w:t xml:space="preserve"> atau bukti independen yang diwajibkan.</w:t>
+        <w:t xml:space="preserve"> yang tidak valid, menggunakan rujukan bukti yang tidak tersedia, atau melampaui batas waktu. Setiap percobaan dan kendala tersebut dicatat secara terpisah dari Soutput model penguji. Hasil penilaian AI tetap harus didukung oleh acuan verifikasi dan bukti independen yang diwajibkan.</w:t>
       </w:r>
     </w:p>
     <w:p>
@@ -34180,22 +33011,7 @@
           <w:rFonts w:ascii="Times New Roman" w:hAnsi="Times New Roman" w:cs="Times New Roman"/>
           <w:color w:val="FF0000"/>
         </w:rPr>
-        <w:t xml:space="preserve">Penilaian dapat dilakukan melalui perintah python -m tesis review SOURCE.json dengan opsi --template, --decisions, atau --evaluate --config; pada TUI, penilai memilih Results dan membuka Review </w:t>
-      </w:r>
-      <w:r>
-        <w:rPr>
-          <w:rFonts w:ascii="Times New Roman" w:hAnsi="Times New Roman" w:cs="Times New Roman"/>
-          <w:color w:val="FF0000"/>
-          <w:i/>
-        </w:rPr>
-        <w:t xml:space="preserve">payload</w:t>
-      </w:r>
-      <w:r>
-        <w:rPr>
-          <w:rFonts w:ascii="Times New Roman" w:hAnsi="Times New Roman" w:cs="Times New Roman"/>
-          <w:color w:val="FF0000"/>
-        </w:rPr>
-        <w:t xml:space="preserve"> evidence. Rubrik dan batas bukti dijelaskan pada docs/reference/thesis_scoring.md.</w:t>
+        <w:t xml:space="preserve">Penilaian dilakukan melalui fasilitas peninjauan bukti pada antarmuka baris perintah atau antarmuka terminal. Fasilitas ini menyediakan penyusunan lembar penilaian, pencatatan keputusan penilai, dan evaluasi berbantuan AI. Seluruh penilaian mengacu pada pedoman rubrik dan batas kekuatan bukti yang didokumentasikan dalam repositori penelitian.</w:t>
       </w:r>
     </w:p>
     <w:p>
@@ -34211,127 +33027,23 @@
           <w:rFonts w:ascii="Times New Roman" w:hAnsi="Times New Roman" w:cs="Times New Roman"/>
           <w:color w:val="FF0000"/>
         </w:rPr>
-        <w:t xml:space="preserve">Metrik </w:t>
+        <w:t xml:space="preserve">Optimalitas pilihan pertama, kesesuaian metode, validitas jalur AKG, dan biaya token dihitung apabila data yang diperlukan tersedia. Jika acuan pemeringkatan, rekaman hubungan pada AKG, penggunaan token, tarif model, atau bukti pendukung lain belum tersedia, nilai metrik terkait dicatat sebagai belum dapat dihitung beserta alasannya. Tingkat keberhasilan </w:t>
       </w:r>
       <w:r>
         <w:rPr>
           <w:rFonts w:ascii="Times New Roman" w:hAnsi="Times New Roman" w:cs="Times New Roman"/>
           <w:color w:val="FF0000"/>
           <w:i/>
-        </w:rPr>
-        <w:t xml:space="preserve">first-choice optimality</w:t>
+          <w:iCs/>
+        </w:rPr>
+        <w:t xml:space="preserve">payload</w:t>
       </w:r>
       <w:r>
         <w:rPr>
           <w:rFonts w:ascii="Times New Roman" w:hAnsi="Times New Roman" w:cs="Times New Roman"/>
           <w:color w:val="FF0000"/>
         </w:rPr>
-        <w:t xml:space="preserve">, </w:t>
-      </w:r>
-      <w:r>
-        <w:rPr>
-          <w:rFonts w:ascii="Times New Roman" w:hAnsi="Times New Roman" w:cs="Times New Roman"/>
-          <w:color w:val="FF0000"/>
-          <w:i/>
-        </w:rPr>
-        <w:t xml:space="preserve">method alignment</w:t>
-      </w:r>
-      <w:r>
-        <w:rPr>
-          <w:rFonts w:ascii="Times New Roman" w:hAnsi="Times New Roman" w:cs="Times New Roman"/>
-          <w:color w:val="FF0000"/>
-        </w:rPr>
-        <w:t xml:space="preserve">, validitas jalur AKG, dan biaya token dihitung ketika masukan yang diperlukan tersedia. Jika </w:t>
-      </w:r>
-      <w:r>
-        <w:rPr>
-          <w:rFonts w:ascii="Times New Roman" w:hAnsi="Times New Roman" w:cs="Times New Roman"/>
-          <w:color w:val="FF0000"/>
-          <w:i/>
-        </w:rPr>
-        <w:t xml:space="preserve">ranking</w:t>
-      </w:r>
-      <w:r>
-        <w:rPr>
-          <w:rFonts w:ascii="Times New Roman" w:hAnsi="Times New Roman" w:cs="Times New Roman"/>
-          <w:color w:val="FF0000"/>
-        </w:rPr>
-        <w:t xml:space="preserve">, rekaman </w:t>
-      </w:r>
-      <w:r>
-        <w:rPr>
-          <w:rFonts w:ascii="Times New Roman" w:hAnsi="Times New Roman" w:cs="Times New Roman"/>
-          <w:color w:val="FF0000"/>
-          <w:i/>
-        </w:rPr>
-        <w:t xml:space="preserve">edge</w:t>
-      </w:r>
-      <w:r>
-        <w:rPr>
-          <w:rFonts w:ascii="Times New Roman" w:hAnsi="Times New Roman" w:cs="Times New Roman"/>
-          <w:color w:val="FF0000"/>
-        </w:rPr>
-        <w:t xml:space="preserve">, penggunaan token, jadwal harga, atau bukti lain yang diperlukan tidak tersedia, nilai terkait tetap null beserta alasannya. Tingkat keberhasilan </w:t>
-      </w:r>
-      <w:r>
-        <w:rPr>
-          <w:rFonts w:ascii="Times New Roman" w:hAnsi="Times New Roman" w:cs="Times New Roman"/>
-          <w:color w:val="FF0000"/>
-          <w:i/>
-        </w:rPr>
-        <w:t xml:space="preserve">payload</w:t>
-      </w:r>
-      <w:r>
-        <w:rPr>
-          <w:rFonts w:ascii="Times New Roman" w:hAnsi="Times New Roman" w:cs="Times New Roman"/>
-          <w:color w:val="FF0000"/>
-        </w:rPr>
-        <w:t xml:space="preserve"> menggunakan jumlah kandidat valid pada tahap </w:t>
-      </w:r>
-      <w:r>
-        <w:rPr>
-          <w:rFonts w:ascii="Times New Roman" w:hAnsi="Times New Roman" w:cs="Times New Roman"/>
-          <w:color w:val="FF0000"/>
-          <w:i/>
-        </w:rPr>
-        <w:t xml:space="preserve">exploit</w:t>
-      </w:r>
-      <w:r>
-        <w:rPr>
-          <w:rFonts w:ascii="Times New Roman" w:hAnsi="Times New Roman" w:cs="Times New Roman"/>
-          <w:color w:val="FF0000"/>
-        </w:rPr>
-        <w:t xml:space="preserve"> atau </w:t>
-      </w:r>
-      <w:r>
-        <w:rPr>
-          <w:rFonts w:ascii="Times New Roman" w:hAnsi="Times New Roman" w:cs="Times New Roman"/>
-          <w:color w:val="FF0000"/>
-          <w:i/>
-        </w:rPr>
-        <w:t xml:space="preserve">bypass</w:t>
-      </w:r>
-      <w:r>
-        <w:rPr>
-          <w:rFonts w:ascii="Times New Roman" w:hAnsi="Times New Roman" w:cs="Times New Roman"/>
-          <w:color w:val="FF0000"/>
-        </w:rPr>
-        <w:t xml:space="preserve"> sebagai penyebut sesuai metriknya. Ketiadaan masukan pada pengukuran terdahulu adalah keterbatasan historis, bukan pernyataan bahwa metrik selalu tidak tersedia. Matriks terdahulu mencakup satu model; komparasi yang direncanakan memerlukan model SOTA dan OSS. Perbandingan model menggunakan konfigurasi, input, </w:t>
-      </w:r>
-      <w:r>
-        <w:rPr>
-          <w:rFonts w:ascii="Times New Roman" w:hAnsi="Times New Roman" w:cs="Times New Roman"/>
-          <w:color w:val="FF0000"/>
-          <w:i/>
-        </w:rPr>
-        <w:t xml:space="preserve">workflow</w:t>
-      </w:r>
-      <w:r>
-        <w:rPr>
-          <w:rFonts w:ascii="Times New Roman" w:hAnsi="Times New Roman" w:cs="Times New Roman"/>
-          <w:color w:val="FF0000"/>
-        </w:rPr>
-        <w:t xml:space="preserve"> penilaian, anggaran, rubrik, dan jumlah pengulangan yang sama.</w:t>
+        <w:t xml:space="preserve"> dihitung menggunakan jumlah kandidat valid pada tahap eksploitasi atau upaya melewati pembatasan sebagai penyebut, sesuai definisi masing-masing metrik. Kekurangan data pada pengukuran terdahulu dicatat sebagai keterbatasan pengukuran tersebut. Matriks pengujian terdahulu mencakup satu model, sedangkan perbandingan yang direncanakan memerlukan model mutakhir dan model sumber terbuka. Keduanya dibandingkan menggunakan konfigurasi, masukan, prosedur penilaian, anggaran, rubrik, dan jumlah pengulangan yang sama.</w:t>
       </w:r>
     </w:p>
     <w:p>
@@ -34347,67 +33059,55 @@
           <w:rFonts w:ascii="Times New Roman" w:hAnsi="Times New Roman" w:cs="Times New Roman"/>
           <w:color w:val="FF0000"/>
         </w:rPr>
-        <w:t xml:space="preserve">Konfirmasi Access Control memerlukan </w:t>
+        <w:t xml:space="preserve">Konfirmasi hasil </w:t>
       </w:r>
       <w:r>
         <w:rPr>
           <w:rFonts w:ascii="Times New Roman" w:hAnsi="Times New Roman" w:cs="Times New Roman"/>
           <w:color w:val="FF0000"/>
           <w:i/>
-        </w:rPr>
-        <w:t xml:space="preserve">oracle</w:t>
+          <w:iCs/>
+        </w:rPr>
+        <w:t xml:space="preserve">Access Control</w:t>
       </w:r>
       <w:r>
         <w:rPr>
           <w:rFonts w:ascii="Times New Roman" w:hAnsi="Times New Roman" w:cs="Times New Roman"/>
           <w:color w:val="FF0000"/>
         </w:rPr>
-        <w:t xml:space="preserve"> izin independen yang mengikat </w:t>
+        <w:t xml:space="preserve"> memerlukan acuan izin independen yang sesuai dengan identitas pengguna, objek, tindakan, sesi, dan kondisi lingkungan uji yang dinilai. Acuan tersebut mencakup tindakan yang diizinkan maupun yang ditolak. Konfirmasi </w:t>
       </w:r>
       <w:r>
         <w:rPr>
           <w:rFonts w:ascii="Times New Roman" w:hAnsi="Times New Roman" w:cs="Times New Roman"/>
           <w:color w:val="FF0000"/>
           <w:i/>
-        </w:rPr>
-        <w:t xml:space="preserve">principal</w:t>
+          <w:iCs/>
+        </w:rPr>
+        <w:t xml:space="preserve">Brute Force</w:t>
       </w:r>
       <w:r>
         <w:rPr>
           <w:rFonts w:ascii="Times New Roman" w:hAnsi="Times New Roman" w:cs="Times New Roman"/>
           <w:color w:val="FF0000"/>
         </w:rPr>
-        <w:t xml:space="preserve">, objek, tindakan, sesi, dan </w:t>
+        <w:t xml:space="preserve"> memerlukan bukti kredensial yang valid, terbentuknya sesi baru, dan kesesuaian identitas pengguna. Sesi awal atau penanda keberhasilan pada halaman saja belum mencukupi. Acuan verifikasi disimpan bersama nilai hash sumber yang disediakan operator. Hasil parsial dinilai sesuai kekuatan buktinya. Pengujian sintetis hanya memeriksa kesesuaian perilaku sistem secara </w:t>
       </w:r>
       <w:r>
         <w:rPr>
           <w:rFonts w:ascii="Times New Roman" w:hAnsi="Times New Roman" w:cs="Times New Roman"/>
           <w:color w:val="FF0000"/>
           <w:i/>
-        </w:rPr>
-        <w:t xml:space="preserve">fixture</w:t>
+          <w:iCs/>
+        </w:rPr>
+        <w:t xml:space="preserve">offline</w:t>
       </w:r>
       <w:r>
         <w:rPr>
           <w:rFonts w:ascii="Times New Roman" w:hAnsi="Times New Roman" w:cs="Times New Roman"/>
           <w:color w:val="FF0000"/>
         </w:rPr>
-        <w:t xml:space="preserve"> yang sama, termasuk kontrol diizinkan dan ditolak. Konfirmasi Brute Force memerlukan bukti kredensial valid, sesi baru, dan identitas yang sesuai. Sesi awal atau penanda halaman saja tidak cukup. </w:t>
-      </w:r>
-      <w:r>
-        <w:rPr>
-          <w:rFonts w:ascii="Times New Roman" w:hAnsi="Times New Roman" w:cs="Times New Roman"/>
-          <w:color w:val="FF0000"/>
-          <w:i/>
-        </w:rPr>
-        <w:t xml:space="preserve">Oracle</w:t>
-      </w:r>
-      <w:r>
-        <w:rPr>
-          <w:rFonts w:ascii="Times New Roman" w:hAnsi="Times New Roman" w:cs="Times New Roman"/>
-          <w:color w:val="FF0000"/>
-        </w:rPr>
-        <w:t xml:space="preserve"> disimpan beserta hash sumber operator. Bukti parsial mengikuti batas skor yang didukung; kontrol sintetis memeriksa kontrak offline dan tidak membuktikan hasil DVWA aktual.</w:t>
+        <w:t xml:space="preserve"> dan belum membuktikan hasil pada DVWA yang sebenarnya.</w:t>
       </w:r>
     </w:p>
     <w:p>
@@ -34423,97 +33123,23 @@
           <w:rFonts w:ascii="Times New Roman" w:hAnsi="Times New Roman" w:cs="Times New Roman"/>
           <w:color w:val="FF0000"/>
         </w:rPr>
-        <w:t xml:space="preserve">Untuk Spayload = 4, bukti sumber, penggunaan hasil kandidat, dan konfirmasi tujuan harus saling terhubung melalui kandidat, metode, kunjungan, </w:t>
+        <w:t xml:space="preserve">Skor Spayload = 4 memerlukan hubungan yang dapat ditelusuri antara bukti sumber, penggunaan hasil kandidat, dan konfirmasi pada langkah tujuan. Hubungan ini mencakup identitas kandidat, metode, kunjungan eksekusi, relasi AKG, data atau sesi yang digunakan, waktu, dan hasil verifikasi. Sexploit menilai konfirmasi keberhasilan metode dan penggunaan hasilnya secara terpisah, sehingga skor tertinggi pada </w:t>
       </w:r>
       <w:r>
         <w:rPr>
           <w:rFonts w:ascii="Times New Roman" w:hAnsi="Times New Roman" w:cs="Times New Roman"/>
           <w:color w:val="FF0000"/>
           <w:i/>
-        </w:rPr>
-        <w:t xml:space="preserve">edge</w:t>
+          <w:iCs/>
+        </w:rPr>
+        <w:t xml:space="preserve">payload</w:t>
       </w:r>
       <w:r>
         <w:rPr>
           <w:rFonts w:ascii="Times New Roman" w:hAnsi="Times New Roman" w:cs="Times New Roman"/>
           <w:color w:val="FF0000"/>
         </w:rPr>
-        <w:t xml:space="preserve">, data atau sesi, waktu, dan </w:t>
-      </w:r>
-      <w:r>
-        <w:rPr>
-          <w:rFonts w:ascii="Times New Roman" w:hAnsi="Times New Roman" w:cs="Times New Roman"/>
-          <w:color w:val="FF0000"/>
-          <w:i/>
-        </w:rPr>
-        <w:t xml:space="preserve">verifier</w:t>
-      </w:r>
-      <w:r>
-        <w:rPr>
-          <w:rFonts w:ascii="Times New Roman" w:hAnsi="Times New Roman" w:cs="Times New Roman"/>
-          <w:color w:val="FF0000"/>
-        </w:rPr>
-        <w:t xml:space="preserve">. Sexploit memeriksa konfirmasi dasar dan penggunaan hasil secara terpisah; batas maksimum </w:t>
-      </w:r>
-      <w:r>
-        <w:rPr>
-          <w:rFonts w:ascii="Times New Roman" w:hAnsi="Times New Roman" w:cs="Times New Roman"/>
-          <w:color w:val="FF0000"/>
-          <w:i/>
-        </w:rPr>
-        <w:t xml:space="preserve">payload</w:t>
-      </w:r>
-      <w:r>
-        <w:rPr>
-          <w:rFonts w:ascii="Times New Roman" w:hAnsi="Times New Roman" w:cs="Times New Roman"/>
-          <w:color w:val="FF0000"/>
-        </w:rPr>
-        <w:t xml:space="preserve"> tidak otomatis menaikkan skor </w:t>
-      </w:r>
-      <w:r>
-        <w:rPr>
-          <w:rFonts w:ascii="Times New Roman" w:hAnsi="Times New Roman" w:cs="Times New Roman"/>
-          <w:color w:val="FF0000"/>
-          <w:i/>
-        </w:rPr>
-        <w:t xml:space="preserve">exploit</w:t>
-      </w:r>
-      <w:r>
-        <w:rPr>
-          <w:rFonts w:ascii="Times New Roman" w:hAnsi="Times New Roman" w:cs="Times New Roman"/>
-          <w:color w:val="FF0000"/>
-        </w:rPr>
-        <w:t xml:space="preserve">. Schain = 1 mencatat peluang lemah dengan </w:t>
-      </w:r>
-      <w:r>
-        <w:rPr>
-          <w:rFonts w:ascii="Times New Roman" w:hAnsi="Times New Roman" w:cs="Times New Roman"/>
-          <w:color w:val="FF0000"/>
-          <w:i/>
-        </w:rPr>
-        <w:t xml:space="preserve">edge</w:t>
-      </w:r>
-      <w:r>
-        <w:rPr>
-          <w:rFonts w:ascii="Times New Roman" w:hAnsi="Times New Roman" w:cs="Times New Roman"/>
-          <w:color w:val="FF0000"/>
-        </w:rPr>
-        <w:t xml:space="preserve"> sah, material yang belum lengkap, bukti parsial, dan status setiap prasyarat. Catatan peluang ini bersifat pasif dan tidak membuka </w:t>
-      </w:r>
-      <w:r>
-        <w:rPr>
-          <w:rFonts w:ascii="Times New Roman" w:hAnsi="Times New Roman" w:cs="Times New Roman"/>
-          <w:color w:val="FF0000"/>
-          <w:i/>
-        </w:rPr>
-        <w:t xml:space="preserve">route</w:t>
-      </w:r>
-      <w:r>
-        <w:rPr>
-          <w:rFonts w:ascii="Times New Roman" w:hAnsi="Times New Roman" w:cs="Times New Roman"/>
-          <w:color w:val="FF0000"/>
-        </w:rPr>
-        <w:t xml:space="preserve">. Nilai 2 memerlukan seluruh prasyarat, nilai 3 satu ketergantungan terverifikasi, dan nilai 4 dua perpindahan yang terhubung secara kausal.</w:t>
+        <w:t xml:space="preserve"> tidak otomatis meningkatkan skor eksploitasi. Pada Schain = 1, terdapat peluang awal yang didukung relasi AKG yang sah, tetapi data atau sesi sumber belum lengkap. Bukti parsial dan status setiap prasyarat dicatat tanpa mengaktifkan jalur lanjutan. Skor 2 memerlukan terpenuhinya seluruh prasyarat, skor 3 memerlukan satu perpindahan yang terverifikasi dengan penggunaan hasil sumber, dan skor 4 memerlukan sedikitnya dua perpindahan yang terhubung secara kausal.</w:t>
       </w:r>
     </w:p>
     <w:p>
@@ -34529,37 +33155,23 @@
           <w:rFonts w:ascii="Times New Roman" w:hAnsi="Times New Roman" w:cs="Times New Roman"/>
           <w:color w:val="FF0000"/>
         </w:rPr>
-        <w:t xml:space="preserve">Contoh </w:t>
+        <w:t xml:space="preserve">Contoh hubungan antar permukaan kerentanan digunakan untuk menjelaskan persyaratan bukti. Hubungan dari perolehan sesi administrator menuju UNION-based </w:t>
       </w:r>
       <w:r>
         <w:rPr>
           <w:rFonts w:ascii="Times New Roman" w:hAnsi="Times New Roman" w:cs="Times New Roman"/>
           <w:color w:val="FF0000"/>
           <w:i/>
-        </w:rPr>
-        <w:t xml:space="preserve">edge</w:t>
+          <w:iCs/>
+        </w:rPr>
+        <w:t xml:space="preserve">SQL Injection</w:t>
       </w:r>
       <w:r>
         <w:rPr>
           <w:rFonts w:ascii="Times New Roman" w:hAnsi="Times New Roman" w:cs="Times New Roman"/>
           <w:color w:val="FF0000"/>
         </w:rPr>
-        <w:t xml:space="preserve"> antarsurface merupakan ilustrasi persyaratan bukti. </w:t>
-      </w:r>
-      <w:r>
-        <w:rPr>
-          <w:rFonts w:ascii="Times New Roman" w:hAnsi="Times New Roman" w:cs="Times New Roman"/>
-          <w:color w:val="FF0000"/>
-          <w:i/>
-        </w:rPr>
-        <w:t xml:space="preserve">Edge</w:t>
-      </w:r>
-      <w:r>
-        <w:rPr>
-          <w:rFonts w:ascii="Times New Roman" w:hAnsi="Times New Roman" w:cs="Times New Roman"/>
-          <w:color w:val="FF0000"/>
-        </w:rPr>
-        <w:t xml:space="preserve"> admin_session_obtained ke sqli_union bersifat konseptual; ketersediaan adapter konsumsi sumber dan verifikasi tujuan harus dibuktikan sebelum dinyatakan terlaksana.</w:t>
+        <w:t xml:space="preserve"> masih bersifat konseptual. Pelaksanaannya baru dapat dinyatakan berhasil apabila mekanisme penggunaan sesi sumber tersedia dan hasil pada metode tujuan telah terverifikasi.</w:t>
       </w:r>
     </w:p>
     <w:p>
@@ -34581,7 +33193,7 @@
           <w:rFonts w:ascii="Times New Roman" w:hAnsi="Times New Roman" w:cs="Times New Roman"/>
           <w:color w:val="FF0000"/>
         </w:rPr>
-        <w:t xml:space="preserve">Bukti dan penerimaan</w:t>
+        <w:t xml:space="preserve">Bukti dan kriteria penerimaan eksperimen</w:t>
       </w:r>
     </w:p>
     <w:p>
@@ -34597,37 +33209,23 @@
           <w:rFonts w:ascii="Times New Roman" w:hAnsi="Times New Roman" w:cs="Times New Roman"/>
           <w:color w:val="FF0000"/>
         </w:rPr>
-        <w:t xml:space="preserve">Contoh kondisi pada tabel bersifat ilustratif. Profil dan </w:t>
+        <w:t xml:space="preserve">Contoh kondisi pada tabel digunakan sebagai ilustrasi penerapan rubrik. Penerimaan hasil eksperimen memerlukan penetapan profil evaluasi dan acuan verifikasi independen yang sesuai dengan lingkungan uji, kemudian pemeriksaan terhadap artefak pada periode pengujian yang bersangkutan. Hasil kontrol </w:t>
       </w:r>
       <w:r>
         <w:rPr>
           <w:rFonts w:ascii="Times New Roman" w:hAnsi="Times New Roman" w:cs="Times New Roman"/>
           <w:color w:val="FF0000"/>
           <w:i/>
-        </w:rPr>
-        <w:t xml:space="preserve">oracle</w:t>
+          <w:iCs/>
+        </w:rPr>
+        <w:t xml:space="preserve">offline</w:t>
       </w:r>
       <w:r>
         <w:rPr>
           <w:rFonts w:ascii="Times New Roman" w:hAnsi="Times New Roman" w:cs="Times New Roman"/>
           <w:color w:val="FF0000"/>
         </w:rPr>
-        <w:t xml:space="preserve"> yang diperlukan untuk </w:t>
-      </w:r>
-      <w:r>
-        <w:rPr>
-          <w:rFonts w:ascii="Times New Roman" w:hAnsi="Times New Roman" w:cs="Times New Roman"/>
-          <w:color w:val="FF0000"/>
-          <w:i/>
-        </w:rPr>
-        <w:t xml:space="preserve">fixture</w:t>
-      </w:r>
-      <w:r>
-        <w:rPr>
-          <w:rFonts w:ascii="Times New Roman" w:hAnsi="Times New Roman" w:cs="Times New Roman"/>
-          <w:color w:val="FF0000"/>
-        </w:rPr>
-        <w:t xml:space="preserve"> aktual serta penerimaan eksperimen pada epoch terkait harus ditetapkan dan diperiksa berdasarkan artefaknya. Kontrol offline dan bukti parsial terdahulu tidak dengan sendirinya membuktikan penerimaan eksperimen live. Rubrik dan batas bukti tersedia pada docs/reference/thesis_scoring.md; dokumen penerimaan dan keterbatasan tersedia pada docs/completed/HANDOFF_SCORING_V4_RANKING_ORACLE_ACCEPTANCE_2026-10-10.md.</w:t>
+        <w:t xml:space="preserve"> dan bukti parsial dari pengujian terdahulu belum cukup untuk menyatakan bahwa eksperimen pada DVWA aktual telah memenuhi kriteria penerimaan. Rincian rubrik, persyaratan bukti, kriteria penerimaan, dan keterbatasan pengujian disimpan dalam dokumentasi penelitian di repositori.</w:t>
       </w:r>
     </w:p>
     <w:p>
@@ -34665,67 +33263,7 @@
           <w:rFonts w:ascii="Times New Roman" w:hAnsi="Times New Roman" w:cs="Times New Roman"/>
           <w:color w:val="FF0000"/>
         </w:rPr>
-        <w:t xml:space="preserve">Setiap </w:t>
-      </w:r>
-      <w:r>
-        <w:rPr>
-          <w:rFonts w:ascii="Times New Roman" w:hAnsi="Times New Roman" w:cs="Times New Roman"/>
-          <w:color w:val="FF0000"/>
-          <w:i/>
-        </w:rPr>
-        <w:t xml:space="preserve">run</w:t>
-      </w:r>
-      <w:r>
-        <w:rPr>
-          <w:rFonts w:ascii="Times New Roman" w:hAnsi="Times New Roman" w:cs="Times New Roman"/>
-          <w:color w:val="FF0000"/>
-        </w:rPr>
-        <w:t xml:space="preserve"> mempunyai </w:t>
-      </w:r>
-      <w:r>
-        <w:rPr>
-          <w:rFonts w:ascii="Times New Roman" w:hAnsi="Times New Roman" w:cs="Times New Roman"/>
-          <w:color w:val="FF0000"/>
-          <w:i/>
-        </w:rPr>
-        <w:t xml:space="preserve">execution_status</w:t>
-      </w:r>
-      <w:r>
-        <w:rPr>
-          <w:rFonts w:ascii="Times New Roman" w:hAnsi="Times New Roman" w:cs="Times New Roman"/>
-          <w:color w:val="FF0000"/>
-        </w:rPr>
-        <w:t xml:space="preserve"> dan </w:t>
-      </w:r>
-      <w:r>
-        <w:rPr>
-          <w:rFonts w:ascii="Times New Roman" w:hAnsi="Times New Roman" w:cs="Times New Roman"/>
-          <w:color w:val="FF0000"/>
-          <w:i/>
-        </w:rPr>
-        <w:t xml:space="preserve">security_outcome</w:t>
-      </w:r>
-      <w:r>
-        <w:rPr>
-          <w:rFonts w:ascii="Times New Roman" w:hAnsi="Times New Roman" w:cs="Times New Roman"/>
-          <w:color w:val="FF0000"/>
-        </w:rPr>
-        <w:t xml:space="preserve"> yang dinilai secara terpisah. Status eksekusi menjelaskan apakah pengujian mencapai akhir secara normal; hasil keamanan menyatakan kesimpulan yang didukung bukti. Eksekusi completed tidak dengan sendirinya berarti </w:t>
-      </w:r>
-      <w:r>
-        <w:rPr>
-          <w:rFonts w:ascii="Times New Roman" w:hAnsi="Times New Roman" w:cs="Times New Roman"/>
-          <w:color w:val="FF0000"/>
-          <w:i/>
-        </w:rPr>
-        <w:t xml:space="preserve">exploit</w:t>
-      </w:r>
-      <w:r>
-        <w:rPr>
-          <w:rFonts w:ascii="Times New Roman" w:hAnsi="Times New Roman" w:cs="Times New Roman"/>
-          <w:color w:val="FF0000"/>
-        </w:rPr>
-        <w:t xml:space="preserve"> terkonfirmasi atau skor akhir telah tersedia.</w:t>
+        <w:t xml:space="preserve">Setiap pengujian mencatat status eksekusi dan hasil keamanan secara terpisah. Status eksekusi menunjukkan apakah proses pengujian selesai secara normal, sedangkan hasil keamanan menyatakan kesimpulan yang didukung oleh bukti. Pengujian yang selesai secara normal dapat menghasilkan temuan yang belum terkonfirmasi atau masih menunggu penilaian akhir.</w:t>
       </w:r>
     </w:p>
     <w:p>
@@ -34773,7 +33311,7 @@
               <w:rPr>
                 <w:color w:val="FF0000"/>
               </w:rPr>
-              <w:t xml:space="preserve">execution_status</w:t>
+              <w:t xml:space="preserve">Status eksekusi</w:t>
             </w:r>
           </w:p>
         </w:tc>
@@ -34814,7 +33352,7 @@
               <w:rPr>
                 <w:color w:val="FF0000"/>
               </w:rPr>
-              <w:t xml:space="preserve">completed</w:t>
+              <w:t xml:space="preserve">Selesai</w:t>
             </w:r>
           </w:p>
         </w:tc>
@@ -34827,7 +33365,7 @@
               <w:rPr>
                 <w:color w:val="FF0000"/>
               </w:rPr>
-              <w:t xml:space="preserve">Koordinat mencapai akhir eksekusi secara normal.</w:t>
+              <w:t xml:space="preserve">Pengujian mencapai akhir eksekusi secara normal.</w:t>
             </w:r>
           </w:p>
         </w:tc>
@@ -34840,7 +33378,7 @@
               <w:rPr>
                 <w:color w:val="FF0000"/>
               </w:rPr>
-              <w:t xml:space="preserve">Metode selesai dengan hasil unconfirmed setelah anggaran habis.</w:t>
+              <w:t xml:space="preserve">Pengujian metode selesai setelah anggaran habis, tetapi hasilnya belum terkonfirmasi.</w:t>
             </w:r>
           </w:p>
         </w:tc>
@@ -34855,7 +33393,7 @@
               <w:rPr>
                 <w:color w:val="FF0000"/>
               </w:rPr>
-              <w:t xml:space="preserve">failed</w:t>
+              <w:t xml:space="preserve">Gagal</w:t>
             </w:r>
           </w:p>
         </w:tc>
@@ -34868,7 +33406,7 @@
               <w:rPr>
                 <w:color w:val="FF0000"/>
               </w:rPr>
-              <w:t xml:space="preserve">Kesalahan runtime, provider, request target, resume, atau artefak utama menghalangi penyelesaian normal.</w:t>
+              <w:t xml:space="preserve">Proses tidak dapat diselesaikan secara normal akibat kesalahan sistem, layanan LLM, komunikasi dengan target, pelanjutan eksekusi, atau penyimpanan artefak utama.</w:t>
             </w:r>
           </w:p>
         </w:tc>
@@ -34881,7 +33419,7 @@
               <w:rPr>
                 <w:color w:val="FF0000"/>
               </w:rPr>
-              <w:t xml:space="preserve">Panggilan provider wajib gagal atau request target mengalami timeout.</w:t>
+              <w:t xml:space="preserve">Pemanggilan layanan LLM yang diwajibkan gagal atau permintaan ke target melampaui batas waktu.</w:t>
             </w:r>
           </w:p>
         </w:tc>
@@ -34896,7 +33434,7 @@
               <w:rPr>
                 <w:color w:val="FF0000"/>
               </w:rPr>
-              <w:t xml:space="preserve">interrupted</w:t>
+              <w:t xml:space="preserve">Dihentikan</w:t>
             </w:r>
           </w:p>
         </w:tc>
@@ -34909,7 +33447,7 @@
               <w:rPr>
                 <w:color w:val="FF0000"/>
               </w:rPr>
-              <w:t xml:space="preserve">Pembatalan eksplisit menghentikan eksekusi sebelum selesai secara normal.</w:t>
+              <w:t xml:space="preserve">Pengujian dihentikan melalui pembatalan eksplisit sebelum mencapai akhir eksekusi.</w:t>
             </w:r>
           </w:p>
         </w:tc>
@@ -34922,7 +33460,7 @@
               <w:rPr>
                 <w:color w:val="FF0000"/>
               </w:rPr>
-              <w:t xml:space="preserve">Operator membatalkan pengujian; state aman terakhir disimpan.</w:t>
+              <w:t xml:space="preserve">Operator membatalkan pengujian dan kondisi aman terakhir disimpan.</w:t>
             </w:r>
           </w:p>
         </w:tc>
@@ -34973,7 +33511,7 @@
               <w:rPr>
                 <w:color w:val="FF0000"/>
               </w:rPr>
-              <w:t xml:space="preserve">security_outcome</w:t>
+              <w:t xml:space="preserve">Hasil keamanan</w:t>
             </w:r>
           </w:p>
         </w:tc>
@@ -35014,7 +33552,7 @@
               <w:rPr>
                 <w:color w:val="FF0000"/>
               </w:rPr>
-              <w:t xml:space="preserve">confirmed</w:t>
+              <w:t xml:space="preserve">Terkonfirmasi</w:t>
             </w:r>
           </w:p>
         </w:tc>
@@ -35027,7 +33565,7 @@
               <w:rPr>
                 <w:color w:val="FF0000"/>
               </w:rPr>
-              <w:t xml:space="preserve">Bukti metode dan kontrol independen yang berlaku mengkonfirmasi kerentanan atau enabling outcome.</w:t>
+              <w:t xml:space="preserve">Bukti metode dan kontrol independen yang sesuai mengonfirmasi kerentanan atau hasil yang memungkinkan pengujian lanjutan.</w:t>
             </w:r>
           </w:p>
         </w:tc>
@@ -35040,7 +33578,7 @@
               <w:rPr>
                 <w:color w:val="FF0000"/>
               </w:rPr>
-              <w:t xml:space="preserve">Ekstraksi yang terikat pada kandidat dikonfirmasi verifier.</w:t>
+              <w:t xml:space="preserve">Hasil ekstraksi dapat ditelusuri ke kandidat tertentu dan telah dikonfirmasi melalui verifikasi.</w:t>
             </w:r>
           </w:p>
         </w:tc>
@@ -35055,7 +33593,7 @@
               <w:rPr>
                 <w:color w:val="FF0000"/>
               </w:rPr>
-              <w:t xml:space="preserve">no_finding</w:t>
+              <w:t xml:space="preserve">Tidak ditemukan indikasi</w:t>
             </w:r>
           </w:p>
         </w:tc>
@@ -35068,7 +33606,7 @@
               <w:rPr>
                 <w:color w:val="FF0000"/>
               </w:rPr>
-              <w:t xml:space="preserve">Bukti negatif yang cukup menunjukkan bahwa sinyal eksploitasi yang dinilai tidak terjadi.</w:t>
+              <w:t xml:space="preserve">Bukti negatif yang memadai menunjukkan bahwa sinyal eksploitasi yang dinilai tidak terjadi.</w:t>
             </w:r>
           </w:p>
         </w:tc>
@@ -35081,7 +33619,7 @@
               <w:rPr>
                 <w:color w:val="FF0000"/>
               </w:rPr>
-              <w:t xml:space="preserve">Kandidat mempunyai respons yang dapat digunakan dan bukti negatif verifier yang terhubung.</w:t>
+              <w:t xml:space="preserve">Respons kandidat dapat diperiksa dan hasil verifikasi menunjukkan bukti negatif yang dapat ditelusuri.</w:t>
             </w:r>
           </w:p>
         </w:tc>
@@ -35096,7 +33634,7 @@
               <w:rPr>
                 <w:color w:val="FF0000"/>
               </w:rPr>
-              <w:t xml:space="preserve">unconfirmed</w:t>
+              <w:t xml:space="preserve">Belum terkonfirmasi</w:t>
             </w:r>
           </w:p>
         </w:tc>
@@ -35109,7 +33647,7 @@
               <w:rPr>
                 <w:color w:val="FF0000"/>
               </w:rPr>
-              <w:t xml:space="preserve">Bukti tidak cukup atau masih ambigu untuk menyimpulkan hasil positif maupun negatif.</w:t>
+              <w:t xml:space="preserve">Bukti belum memadai atau masih ambigu untuk menyimpulkan hasil positif maupun negatif.</w:t>
             </w:r>
           </w:p>
         </w:tc>
@@ -35122,7 +33660,7 @@
               <w:rPr>
                 <w:color w:val="FF0000"/>
               </w:rPr>
-              <w:t xml:space="preserve">Sinyal parsial, rujukan kandidat hilang, atau keputusan verifier unverified.</w:t>
+              <w:t xml:space="preserve">Sinyal masih parsial, rujukan kandidat tidak tersedia, atau hasil belum dapat diverifikasi.</w:t>
             </w:r>
           </w:p>
         </w:tc>
@@ -35137,7 +33675,7 @@
               <w:rPr>
                 <w:color w:val="FF0000"/>
               </w:rPr>
-              <w:t xml:space="preserve">fixture_limited</w:t>
+              <w:t xml:space="preserve">Terbatas oleh lingkungan uji</w:t>
             </w:r>
           </w:p>
         </w:tc>
@@ -35150,7 +33688,7 @@
               <w:rPr>
                 <w:color w:val="FF0000"/>
               </w:rPr>
-              <w:t xml:space="preserve">Kontrol principal, izin, sesi, atau fixture yang wajib belum tersedia untuk mendukung kesimpulan.</w:t>
+              <w:t xml:space="preserve">Kontrol identitas pengguna, izin, sesi, atau kondisi lingkungan uji yang diwajibkan belum tersedia untuk mendukung kesimpulan.</w:t>
             </w:r>
           </w:p>
         </w:tc>
@@ -35163,7 +33701,7 @@
               <w:rPr>
                 <w:color w:val="FF0000"/>
               </w:rPr>
-              <w:t xml:space="preserve">Akses objek terlihat, tetapi oracle izin independen belum tersedia.</w:t>
+              <w:t xml:space="preserve">Akses ke objek terlihat, tetapi acuan izin independen belum tersedia.</w:t>
             </w:r>
           </w:p>
         </w:tc>
@@ -35182,52 +33720,7 @@
           <w:rFonts w:ascii="Times New Roman" w:hAnsi="Times New Roman" w:cs="Times New Roman"/>
           <w:color w:val="FF0000"/>
         </w:rPr>
-        <w:t xml:space="preserve">Alasan hasil keamanan dicatat pada </w:t>
-      </w:r>
-      <w:r>
-        <w:rPr>
-          <w:rFonts w:ascii="Times New Roman" w:hAnsi="Times New Roman" w:cs="Times New Roman"/>
-          <w:color w:val="FF0000"/>
-          <w:i/>
-        </w:rPr>
-        <w:t xml:space="preserve">security_outcome_reason</w:t>
-      </w:r>
-      <w:r>
-        <w:rPr>
-          <w:rFonts w:ascii="Times New Roman" w:hAnsi="Times New Roman" w:cs="Times New Roman"/>
-          <w:color w:val="FF0000"/>
-        </w:rPr>
-        <w:t xml:space="preserve"> dengan code, detail, dan evidence_refs, misalnya PARTIAL_SIGNAL, PERMISSION_ORACLE_UNAVAILABLE, SESSION_ORACLE_UNAVAILABLE, atau VERIFIED_NEGATIVE. Kesalahan dan pembatalan dicatat terpisah pada </w:t>
-      </w:r>
-      <w:r>
-        <w:rPr>
-          <w:rFonts w:ascii="Times New Roman" w:hAnsi="Times New Roman" w:cs="Times New Roman"/>
-          <w:color w:val="FF0000"/>
-          <w:i/>
-        </w:rPr>
-        <w:t xml:space="preserve">execution_reason</w:t>
-      </w:r>
-      <w:r>
-        <w:rPr>
-          <w:rFonts w:ascii="Times New Roman" w:hAnsi="Times New Roman" w:cs="Times New Roman"/>
-          <w:color w:val="FF0000"/>
-        </w:rPr>
-        <w:t xml:space="preserve">, misalnya LLM_RUNTIME_FAILURE, TARGET_TRANSPORT_FAILURE, ARTIFACT_WRITE_FAILURE, atau CANCELLED. No_finding memerlukan bukti negatif yang nyata; respons atau </w:t>
-      </w:r>
-      <w:r>
-        <w:rPr>
-          <w:rFonts w:ascii="Times New Roman" w:hAnsi="Times New Roman" w:cs="Times New Roman"/>
-          <w:color w:val="FF0000"/>
-          <w:i/>
-        </w:rPr>
-        <w:t xml:space="preserve">oracle</w:t>
-      </w:r>
-      <w:r>
-        <w:rPr>
-          <w:rFonts w:ascii="Times New Roman" w:hAnsi="Times New Roman" w:cs="Times New Roman"/>
-          <w:color w:val="FF0000"/>
-        </w:rPr>
-        <w:t xml:space="preserve"> yang hilang tetap unconfirmed atau fixture_limited sesuai alasannya.</w:t>
+        <w:t xml:space="preserve">Alasan penetapan hasil keamanan dicatat bersama kategori, uraian, dan rujukan buktinya. Alasan tersebut dapat berupa sinyal parsial, ketiadaan acuan izin atau sesi independen, maupun bukti negatif yang telah terverifikasi. Kesalahan eksekusi dan pembatalan dicatat secara terpisah, antara lain kegagalan layanan LLM, komunikasi dengan target, penyimpanan artefak, atau pembatalan oleh operator. Kesimpulan tidak ditemukannya indikasi hanya diberikan apabila tersedia bukti negatif yang memadai. Ketiadaan respons atau acuan verifikasi dicatat sebagai hasil yang belum terkonfirmasi atau terbatas oleh lingkungan uji, sesuai penyebabnya.</w:t>
       </w:r>
     </w:p>
     <w:p>
@@ -35243,67 +33736,7 @@
           <w:rFonts w:ascii="Times New Roman" w:hAnsi="Times New Roman" w:cs="Times New Roman"/>
           <w:color w:val="FF0000"/>
         </w:rPr>
-        <w:t xml:space="preserve">Cakupan eksekusi menghitung completed dengan hasil confirmed, no_finding, unconfirmed, maupun fixture_limited. Jumlah hasil keamanan dilaporkan terpisah dari keandalan eksekusi dan tingkat konfirmasi. Koordinat skipped yang belum dijalankan tidak masuk cakupan. Alias status=success berarti eksekusi selesai; </w:t>
-      </w:r>
-      <w:r>
-        <w:rPr>
-          <w:rFonts w:ascii="Times New Roman" w:hAnsi="Times New Roman" w:cs="Times New Roman"/>
-          <w:color w:val="FF0000"/>
-          <w:i/>
-        </w:rPr>
-        <w:t xml:space="preserve">task_result</w:t>
-      </w:r>
-      <w:r>
-        <w:rPr>
-          <w:rFonts w:ascii="Times New Roman" w:hAnsi="Times New Roman" w:cs="Times New Roman"/>
-          <w:color w:val="FF0000"/>
-        </w:rPr>
-        <w:t xml:space="preserve"> dan </w:t>
-      </w:r>
-      <w:r>
-        <w:rPr>
-          <w:rFonts w:ascii="Times New Roman" w:hAnsi="Times New Roman" w:cs="Times New Roman"/>
-          <w:color w:val="FF0000"/>
-          <w:i/>
-        </w:rPr>
-        <w:t xml:space="preserve">incomplete_reason</w:t>
-      </w:r>
-      <w:r>
-        <w:rPr>
-          <w:rFonts w:ascii="Times New Roman" w:hAnsi="Times New Roman" w:cs="Times New Roman"/>
-          <w:color w:val="FF0000"/>
-        </w:rPr>
-        <w:t xml:space="preserve"> tetap disimpan untuk kompatibilitas. Status historis dan atribusi yang tidak tersedia tetap dicatat tanpa mengubah artefak sumber. </w:t>
-      </w:r>
-      <w:r>
-        <w:rPr>
-          <w:rFonts w:ascii="Times New Roman" w:hAnsi="Times New Roman" w:cs="Times New Roman"/>
-          <w:color w:val="FF0000"/>
-          <w:i/>
-        </w:rPr>
-        <w:t xml:space="preserve">Srun_final</w:t>
-      </w:r>
-      <w:r>
-        <w:rPr>
-          <w:rFonts w:ascii="Times New Roman" w:hAnsi="Times New Roman" w:cs="Times New Roman"/>
-          <w:color w:val="FF0000"/>
-        </w:rPr>
-        <w:t xml:space="preserve"> hanya diterbitkan setelah komponen, penyebut yang memenuhi syarat, dan </w:t>
-      </w:r>
-      <w:r>
-        <w:rPr>
-          <w:rFonts w:ascii="Times New Roman" w:hAnsi="Times New Roman" w:cs="Times New Roman"/>
-          <w:color w:val="FF0000"/>
-          <w:i/>
-        </w:rPr>
-        <w:t xml:space="preserve">workflow</w:t>
-      </w:r>
-      <w:r>
-        <w:rPr>
-          <w:rFonts w:ascii="Times New Roman" w:hAnsi="Times New Roman" w:cs="Times New Roman"/>
-          <w:color w:val="FF0000"/>
-        </w:rPr>
-        <w:t xml:space="preserve"> penilaian lengkap. Satu komponen bernilai nol tidak membuat seluruh skor nol: vektor (3,0,0,0,3) menghasilkan 1.2000.</w:t>
+        <w:t xml:space="preserve">Cakupan eksekusi mencakup seluruh pengujian yang selesai secara normal, baik dengan hasil terkonfirmasi, tidak ditemukan indikasi, belum terkonfirmasi, maupun terbatas oleh lingkungan uji. Jumlah pada setiap kategori hasil keamanan dilaporkan secara terpisah dari keandalan eksekusi dan tingkat konfirmasi. Skenario yang dilewati dan belum dijalankan tidak dimasukkan dalam cakupan. Penanda keberhasilan eksekusi pada format artefak lama menunjukkan bahwa proses telah selesai. Hasil tugas dan alasan ketidaklengkapannya tetap disimpan agar catatan lama dapat dibaca. Status historis dan informasi sumber yang belum tersedia dipertahankan tanpa mengubah artefak asli. Skor akhir Srun hanya diterbitkan setelah komponen penilaian, jumlah kandidat yang memenuhi syarat, dan prosedur penilaian telah lengkap. Nilai nol pada satu komponen tetap diperhitungkan sesuai bobotnya. Sebagai contoh, susunan skor (3,0,0,0,3) menghasilkan 1.2000.</w:t>
       </w:r>
     </w:p>
     <w:p>

</xml_diff>